<commit_message>
update chatbot,model embedding  and update admin_dashboard and new sql quary
</commit_message>
<xml_diff>
--- a/Loan_Features.docx
+++ b/Loan_Features.docx
@@ -43,7 +43,7 @@
     <w:p>
       <w:pPr>
         <w:rPr>
-          <w:rFonts w:ascii="TH Sarabun New" w:hAnsi="TH Sarabun New" w:cs="TH Sarabun New" w:hint="cs"/>
+          <w:rFonts w:ascii="TH Sarabun New" w:hAnsi="TH Sarabun New" w:cs="TH Sarabun New"/>
           <w:sz w:val="36"/>
           <w:szCs w:val="36"/>
         </w:rPr>
@@ -156,15 +156,6 @@
           <w:szCs w:val="36"/>
         </w:rPr>
       </w:pPr>
-    </w:p>
-    <w:p>
-      <w:pPr>
-        <w:rPr>
-          <w:rFonts w:ascii="TH Sarabun New" w:hAnsi="TH Sarabun New" w:cs="TH Sarabun New" w:hint="cs"/>
-          <w:sz w:val="36"/>
-          <w:szCs w:val="36"/>
-        </w:rPr>
-      </w:pPr>
       <w:r>
         <w:rPr>
           <w:rFonts w:ascii="TH Sarabun New" w:hAnsi="TH Sarabun New" w:cs="TH Sarabun New"/>
@@ -178,7 +169,7 @@
     <w:p>
       <w:pPr>
         <w:rPr>
-          <w:rFonts w:ascii="TH Sarabun New" w:hAnsi="TH Sarabun New" w:cs="TH Sarabun New" w:hint="cs"/>
+          <w:rFonts w:ascii="TH Sarabun New" w:hAnsi="TH Sarabun New" w:cs="TH Sarabun New"/>
           <w:sz w:val="36"/>
           <w:szCs w:val="36"/>
         </w:rPr>
@@ -197,7 +188,7 @@
       <w:pPr>
         <w:ind w:firstLine="720"/>
         <w:rPr>
-          <w:rFonts w:ascii="TH Sarabun New" w:hAnsi="TH Sarabun New" w:cs="TH Sarabun New" w:hint="cs"/>
+          <w:rFonts w:ascii="TH Sarabun New" w:hAnsi="TH Sarabun New" w:cs="TH Sarabun New"/>
           <w:sz w:val="36"/>
           <w:szCs w:val="36"/>
         </w:rPr>
@@ -244,7 +235,26 @@
     <w:p>
       <w:pPr>
         <w:rPr>
-          <w:rFonts w:ascii="TH Sarabun New" w:hAnsi="TH Sarabun New" w:cs="TH Sarabun New" w:hint="cs"/>
+          <w:rFonts w:ascii="TH Sarabun New" w:hAnsi="TH Sarabun New" w:cs="TH Sarabun New"/>
+          <w:sz w:val="36"/>
+          <w:szCs w:val="36"/>
+        </w:rPr>
+      </w:pPr>
+      <w:r>
+        <w:rPr>
+          <w:rFonts w:ascii="TH Sarabun New" w:hAnsi="TH Sarabun New" w:cs="TH Sarabun New"/>
+          <w:sz w:val="36"/>
+          <w:szCs w:val="36"/>
+          <w:cs/>
+        </w:rPr>
+        <w:t>2. คุณสมบัติทั่วไปและลักษณะต้องห้ามของนักเรียนหรือนักศึกษาผู้กู้ยืมเงินกองทุนทั้ง 4 ลักษณะ</w:t>
+      </w:r>
+    </w:p>
+    <w:p>
+      <w:pPr>
+        <w:ind w:firstLine="720"/>
+        <w:rPr>
+          <w:rFonts w:ascii="TH Sarabun New" w:hAnsi="TH Sarabun New" w:cs="TH Sarabun New"/>
           <w:sz w:val="36"/>
           <w:szCs w:val="36"/>
         </w:rPr>
@@ -257,25 +267,6 @@
           <w:cs/>
         </w:rPr>
         <w:lastRenderedPageBreak/>
-        <w:t>2. คุณสมบัติทั่วไปและลักษณะต้องห้ามของนักเรียนหรือนักศึกษาผู้กู้ยืมเงินกองทุนทั้ง 4 ลักษณะ</w:t>
-      </w:r>
-    </w:p>
-    <w:p>
-      <w:pPr>
-        <w:ind w:firstLine="720"/>
-        <w:rPr>
-          <w:rFonts w:ascii="TH Sarabun New" w:hAnsi="TH Sarabun New" w:cs="TH Sarabun New" w:hint="cs"/>
-          <w:sz w:val="36"/>
-          <w:szCs w:val="36"/>
-        </w:rPr>
-      </w:pPr>
-      <w:r>
-        <w:rPr>
-          <w:rFonts w:ascii="TH Sarabun New" w:hAnsi="TH Sarabun New" w:cs="TH Sarabun New"/>
-          <w:sz w:val="36"/>
-          <w:szCs w:val="36"/>
-          <w:cs/>
-        </w:rPr>
         <w:t>นักเรียนหรือนักศึกษาที่จะขอกู้ยืมเงินเพื่อการศึกษาจะต้องมีคุณสมบัติทั่วไปและไม่มีลักษณะต้องห้าม ดังนี้</w:t>
       </w:r>
     </w:p>
@@ -283,7 +274,7 @@
       <w:pPr>
         <w:ind w:firstLine="720"/>
         <w:rPr>
-          <w:rFonts w:ascii="TH Sarabun New" w:hAnsi="TH Sarabun New" w:cs="TH Sarabun New" w:hint="cs"/>
+          <w:rFonts w:ascii="TH Sarabun New" w:hAnsi="TH Sarabun New" w:cs="TH Sarabun New"/>
           <w:sz w:val="36"/>
           <w:szCs w:val="36"/>
         </w:rPr>
@@ -302,7 +293,7 @@
       <w:pPr>
         <w:ind w:firstLine="720"/>
         <w:rPr>
-          <w:rFonts w:ascii="TH Sarabun New" w:hAnsi="TH Sarabun New" w:cs="TH Sarabun New" w:hint="cs"/>
+          <w:rFonts w:ascii="TH Sarabun New" w:hAnsi="TH Sarabun New" w:cs="TH Sarabun New"/>
           <w:sz w:val="36"/>
           <w:szCs w:val="36"/>
         </w:rPr>
@@ -321,7 +312,7 @@
       <w:pPr>
         <w:ind w:firstLine="720"/>
         <w:rPr>
-          <w:rFonts w:ascii="TH Sarabun New" w:hAnsi="TH Sarabun New" w:cs="TH Sarabun New" w:hint="cs"/>
+          <w:rFonts w:ascii="TH Sarabun New" w:hAnsi="TH Sarabun New" w:cs="TH Sarabun New"/>
           <w:sz w:val="36"/>
           <w:szCs w:val="36"/>
         </w:rPr>
@@ -340,7 +331,7 @@
       <w:pPr>
         <w:ind w:firstLine="720"/>
         <w:rPr>
-          <w:rFonts w:ascii="TH Sarabun New" w:hAnsi="TH Sarabun New" w:cs="TH Sarabun New" w:hint="cs"/>
+          <w:rFonts w:ascii="TH Sarabun New" w:hAnsi="TH Sarabun New" w:cs="TH Sarabun New"/>
           <w:sz w:val="36"/>
           <w:szCs w:val="36"/>
         </w:rPr>
@@ -359,7 +350,7 @@
       <w:pPr>
         <w:ind w:firstLine="720"/>
         <w:rPr>
-          <w:rFonts w:ascii="TH Sarabun New" w:hAnsi="TH Sarabun New" w:cs="TH Sarabun New" w:hint="cs"/>
+          <w:rFonts w:ascii="TH Sarabun New" w:hAnsi="TH Sarabun New" w:cs="TH Sarabun New"/>
           <w:sz w:val="36"/>
           <w:szCs w:val="36"/>
         </w:rPr>
@@ -378,7 +369,7 @@
       <w:pPr>
         <w:ind w:firstLine="720"/>
         <w:rPr>
-          <w:rFonts w:ascii="TH Sarabun New" w:hAnsi="TH Sarabun New" w:cs="TH Sarabun New" w:hint="cs"/>
+          <w:rFonts w:ascii="TH Sarabun New" w:hAnsi="TH Sarabun New" w:cs="TH Sarabun New"/>
           <w:sz w:val="36"/>
           <w:szCs w:val="36"/>
         </w:rPr>
@@ -397,7 +388,7 @@
       <w:pPr>
         <w:ind w:firstLine="720"/>
         <w:rPr>
-          <w:rFonts w:ascii="TH Sarabun New" w:hAnsi="TH Sarabun New" w:cs="TH Sarabun New" w:hint="cs"/>
+          <w:rFonts w:ascii="TH Sarabun New" w:hAnsi="TH Sarabun New" w:cs="TH Sarabun New"/>
           <w:sz w:val="36"/>
           <w:szCs w:val="36"/>
         </w:rPr>
@@ -416,7 +407,7 @@
       <w:pPr>
         <w:ind w:firstLine="720"/>
         <w:rPr>
-          <w:rFonts w:ascii="TH Sarabun New" w:hAnsi="TH Sarabun New" w:cs="TH Sarabun New" w:hint="cs"/>
+          <w:rFonts w:ascii="TH Sarabun New" w:hAnsi="TH Sarabun New" w:cs="TH Sarabun New"/>
           <w:sz w:val="36"/>
           <w:szCs w:val="36"/>
         </w:rPr>
@@ -435,7 +426,7 @@
       <w:pPr>
         <w:ind w:firstLine="720"/>
         <w:rPr>
-          <w:rFonts w:ascii="TH Sarabun New" w:hAnsi="TH Sarabun New" w:cs="TH Sarabun New" w:hint="cs"/>
+          <w:rFonts w:ascii="TH Sarabun New" w:hAnsi="TH Sarabun New" w:cs="TH Sarabun New"/>
           <w:sz w:val="36"/>
           <w:szCs w:val="36"/>
         </w:rPr>
@@ -454,7 +445,7 @@
       <w:pPr>
         <w:ind w:firstLine="720"/>
         <w:rPr>
-          <w:rFonts w:ascii="TH Sarabun New" w:hAnsi="TH Sarabun New" w:cs="TH Sarabun New" w:hint="cs"/>
+          <w:rFonts w:ascii="TH Sarabun New" w:hAnsi="TH Sarabun New" w:cs="TH Sarabun New"/>
           <w:sz w:val="36"/>
           <w:szCs w:val="36"/>
         </w:rPr>
@@ -473,7 +464,7 @@
       <w:pPr>
         <w:ind w:firstLine="720"/>
         <w:rPr>
-          <w:rFonts w:ascii="TH Sarabun New" w:hAnsi="TH Sarabun New" w:cs="TH Sarabun New" w:hint="cs"/>
+          <w:rFonts w:ascii="TH Sarabun New" w:hAnsi="TH Sarabun New" w:cs="TH Sarabun New"/>
           <w:sz w:val="36"/>
           <w:szCs w:val="36"/>
         </w:rPr>
@@ -492,7 +483,26 @@
       <w:pPr>
         <w:ind w:firstLine="720"/>
         <w:rPr>
-          <w:rFonts w:ascii="TH Sarabun New" w:hAnsi="TH Sarabun New" w:cs="TH Sarabun New" w:hint="cs"/>
+          <w:rFonts w:ascii="TH Sarabun New" w:hAnsi="TH Sarabun New" w:cs="TH Sarabun New"/>
+          <w:sz w:val="36"/>
+          <w:szCs w:val="36"/>
+        </w:rPr>
+      </w:pPr>
+      <w:r>
+        <w:rPr>
+          <w:rFonts w:ascii="TH Sarabun New" w:hAnsi="TH Sarabun New" w:cs="TH Sarabun New"/>
+          <w:sz w:val="36"/>
+          <w:szCs w:val="36"/>
+          <w:cs/>
+        </w:rPr>
+        <w:t>5. ไม่เป็นหรือเคยเป็นผู้ที่ผิดนัดชำระหนี้กับกองทุน เว้นแต่ได้ชำระหนี้ดังกล่าวครบถ้วนแล้ว</w:t>
+      </w:r>
+    </w:p>
+    <w:p>
+      <w:pPr>
+        <w:ind w:firstLine="720"/>
+        <w:rPr>
+          <w:rFonts w:ascii="TH Sarabun New" w:hAnsi="TH Sarabun New" w:cs="TH Sarabun New"/>
           <w:sz w:val="36"/>
           <w:szCs w:val="36"/>
         </w:rPr>
@@ -505,32 +515,13 @@
           <w:cs/>
         </w:rPr>
         <w:lastRenderedPageBreak/>
-        <w:t>5. ไม่เป็นหรือเคยเป็นผู้ที่ผิดนัดชำระหนี้กับกองทุน เว้นแต่ได้ชำระหนี้ดังกล่าวครบถ้วนแล้ว</w:t>
-      </w:r>
-    </w:p>
-    <w:p>
-      <w:pPr>
-        <w:ind w:firstLine="720"/>
-        <w:rPr>
-          <w:rFonts w:ascii="TH Sarabun New" w:hAnsi="TH Sarabun New" w:cs="TH Sarabun New"/>
-          <w:sz w:val="36"/>
-          <w:szCs w:val="36"/>
-        </w:rPr>
-      </w:pPr>
-      <w:r>
-        <w:rPr>
-          <w:rFonts w:ascii="TH Sarabun New" w:hAnsi="TH Sarabun New" w:cs="TH Sarabun New"/>
-          <w:sz w:val="36"/>
-          <w:szCs w:val="36"/>
-          <w:cs/>
-        </w:rPr>
         <w:t>นักเรียนหรือนักศึกษาผู้ที่จะขอกู้ยืมเงินเพื่อการศึกษาทั้ง 4 ลักษณะ นอกจากจะต้องมีคุณสมบัติทั่วไปและไม่มีลักษณะต้องห้ามตามที่กำหนดในข้อ 2.1 และ 2.2 แล้ว จะต้องมีคุณสมบัติเฉพาะอื่นตามที่คณะกรรมการประกาศกำหนดสำหรับการกู้ยืมเงินเพื่อการศึกษาในลักษณะนั้นๆ ด้วย</w:t>
       </w:r>
     </w:p>
     <w:p>
       <w:pPr>
         <w:rPr>
-          <w:rFonts w:ascii="TH Sarabun New" w:hAnsi="TH Sarabun New" w:cs="TH Sarabun New" w:hint="cs"/>
+          <w:rFonts w:ascii="TH Sarabun New" w:hAnsi="TH Sarabun New" w:cs="TH Sarabun New"/>
           <w:sz w:val="36"/>
           <w:szCs w:val="36"/>
         </w:rPr>
@@ -549,7 +540,7 @@
       <w:pPr>
         <w:ind w:firstLine="720"/>
         <w:rPr>
-          <w:rFonts w:ascii="TH Sarabun New" w:hAnsi="TH Sarabun New" w:cs="TH Sarabun New" w:hint="cs"/>
+          <w:rFonts w:ascii="TH Sarabun New" w:hAnsi="TH Sarabun New" w:cs="TH Sarabun New"/>
           <w:sz w:val="36"/>
           <w:szCs w:val="36"/>
         </w:rPr>
@@ -568,25 +559,42 @@
       <w:pPr>
         <w:ind w:firstLine="720"/>
         <w:rPr>
-          <w:rFonts w:ascii="TH Sarabun New" w:hAnsi="TH Sarabun New" w:cs="TH Sarabun New" w:hint="cs"/>
-          <w:sz w:val="36"/>
-          <w:szCs w:val="36"/>
-        </w:rPr>
-      </w:pPr>
-      <w:r>
-        <w:rPr>
-          <w:rFonts w:ascii="TH Sarabun New" w:hAnsi="TH Sarabun New" w:cs="TH Sarabun New"/>
-          <w:sz w:val="36"/>
-          <w:szCs w:val="36"/>
-          <w:cs/>
-        </w:rPr>
-        <w:t>1. เป็นผู้ที่มีรายได้ต่อครอบครัวไม่เกินสามแสนหกหมื่นบาทต่อปี ทั้งนี้ รายได้ต่อครอบครัวให้พิจารณาจากหลักเกณฑ์ข้อใดข้อหนึ่ง ดังนี้</w:t>
-      </w:r>
-    </w:p>
-    <w:p>
-      <w:pPr>
-        <w:rPr>
-          <w:rFonts w:ascii="TH Sarabun New" w:hAnsi="TH Sarabun New" w:cs="TH Sarabun New" w:hint="cs"/>
+          <w:rFonts w:ascii="TH Sarabun New" w:hAnsi="TH Sarabun New" w:cs="TH Sarabun New"/>
+          <w:sz w:val="36"/>
+          <w:szCs w:val="36"/>
+        </w:rPr>
+      </w:pPr>
+      <w:r>
+        <w:rPr>
+          <w:rFonts w:ascii="TH Sarabun New" w:hAnsi="TH Sarabun New" w:cs="TH Sarabun New"/>
+          <w:sz w:val="36"/>
+          <w:szCs w:val="36"/>
+          <w:cs/>
+        </w:rPr>
+        <w:t>1. เป็นผู้ที่มีรายได้ต่อครอบครัวไม่เกิน</w:t>
+      </w:r>
+      <w:r>
+        <w:rPr>
+          <w:rFonts w:ascii="TH Sarabun New" w:hAnsi="TH Sarabun New" w:cs="TH Sarabun New"/>
+          <w:sz w:val="36"/>
+          <w:szCs w:val="36"/>
+        </w:rPr>
+        <w:t>360,000</w:t>
+      </w:r>
+      <w:r>
+        <w:rPr>
+          <w:rFonts w:ascii="TH Sarabun New" w:hAnsi="TH Sarabun New" w:cs="TH Sarabun New"/>
+          <w:sz w:val="36"/>
+          <w:szCs w:val="36"/>
+          <w:cs/>
+        </w:rPr>
+        <w:t>บาทต่อปี ทั้งนี้ รายได้ต่อครอบครัวให้พิจารณาจากหลักเกณฑ์ข้อใดข้อหนึ่ง ดังนี้</w:t>
+      </w:r>
+    </w:p>
+    <w:p>
+      <w:pPr>
+        <w:rPr>
+          <w:rFonts w:ascii="TH Sarabun New" w:hAnsi="TH Sarabun New" w:cs="TH Sarabun New"/>
           <w:sz w:val="36"/>
           <w:szCs w:val="36"/>
         </w:rPr>
@@ -604,7 +612,7 @@
     <w:p>
       <w:pPr>
         <w:rPr>
-          <w:rFonts w:ascii="TH Sarabun New" w:hAnsi="TH Sarabun New" w:cs="TH Sarabun New" w:hint="cs"/>
+          <w:rFonts w:ascii="TH Sarabun New" w:hAnsi="TH Sarabun New" w:cs="TH Sarabun New"/>
           <w:sz w:val="36"/>
           <w:szCs w:val="36"/>
         </w:rPr>
@@ -622,7 +630,7 @@
     <w:p>
       <w:pPr>
         <w:rPr>
-          <w:rFonts w:ascii="TH Sarabun New" w:hAnsi="TH Sarabun New" w:cs="TH Sarabun New" w:hint="cs"/>
+          <w:rFonts w:ascii="TH Sarabun New" w:hAnsi="TH Sarabun New" w:cs="TH Sarabun New"/>
           <w:sz w:val="36"/>
           <w:szCs w:val="36"/>
         </w:rPr>
@@ -640,7 +648,7 @@
     <w:p>
       <w:pPr>
         <w:rPr>
-          <w:rFonts w:ascii="TH Sarabun New" w:hAnsi="TH Sarabun New" w:cs="TH Sarabun New" w:hint="cs"/>
+          <w:rFonts w:ascii="TH Sarabun New" w:hAnsi="TH Sarabun New" w:cs="TH Sarabun New"/>
           <w:sz w:val="36"/>
           <w:szCs w:val="36"/>
         </w:rPr>
@@ -659,7 +667,7 @@
       <w:pPr>
         <w:ind w:firstLine="720"/>
         <w:rPr>
-          <w:rFonts w:ascii="TH Sarabun New" w:hAnsi="TH Sarabun New" w:cs="TH Sarabun New" w:hint="cs"/>
+          <w:rFonts w:ascii="TH Sarabun New" w:hAnsi="TH Sarabun New" w:cs="TH Sarabun New"/>
           <w:sz w:val="36"/>
           <w:szCs w:val="36"/>
         </w:rPr>
@@ -705,7 +713,7 @@
     <w:p>
       <w:pPr>
         <w:rPr>
-          <w:rFonts w:ascii="TH Sarabun New" w:hAnsi="TH Sarabun New" w:cs="TH Sarabun New" w:hint="cs"/>
+          <w:rFonts w:ascii="TH Sarabun New" w:hAnsi="TH Sarabun New" w:cs="TH Sarabun New"/>
           <w:sz w:val="36"/>
           <w:szCs w:val="36"/>
         </w:rPr>
@@ -744,184 +752,569 @@
     <w:p>
       <w:pPr>
         <w:rPr>
+          <w:rFonts w:ascii="TH Sarabun New" w:hAnsi="TH Sarabun New" w:cs="TH Sarabun New"/>
+          <w:sz w:val="36"/>
+          <w:szCs w:val="36"/>
+        </w:rPr>
+      </w:pPr>
+      <w:r>
+        <w:rPr>
+          <w:rFonts w:ascii="TH Sarabun New" w:hAnsi="TH Sarabun New" w:cs="TH Sarabun New"/>
+          <w:sz w:val="36"/>
+          <w:szCs w:val="36"/>
+          <w:cs/>
+        </w:rPr>
+        <w:t>(ข) หลักสูตร/ประเภทวิชาและสาขาวิชาเป็นไปตามประกาศที่คณะกรรมการกำหนด</w:t>
+      </w:r>
+    </w:p>
+    <w:p>
+      <w:pPr>
+        <w:ind w:firstLine="720"/>
+        <w:rPr>
+          <w:rFonts w:ascii="TH Sarabun New" w:hAnsi="TH Sarabun New" w:cs="TH Sarabun New"/>
+          <w:sz w:val="36"/>
+          <w:szCs w:val="36"/>
+        </w:rPr>
+      </w:pPr>
+      <w:r>
+        <w:rPr>
+          <w:rFonts w:ascii="TH Sarabun New" w:hAnsi="TH Sarabun New" w:cs="TH Sarabun New"/>
+          <w:sz w:val="36"/>
+          <w:szCs w:val="36"/>
+          <w:cs/>
+        </w:rPr>
+        <w:t>4. เป็นผู้ที่ทำประโยชน์ต่อสังคมหรือสาธารณะในระหว่างปีการศึกษาก่อนหน้าปีการศึกษาที่จะขอ กู้ยืมเงิน โดยมีหลักฐานการเข้าร่วมโครงการ/กิจกรรมที่มีประโยชน์ต่อสังคม หรือสาธารณะที่น่าเชื่อถือตามจำนวนชั่วโมงที่กำหนดสำหรับผู้ขอกู้ยืมเงินแต่ละกลุ่ม ดังต่อไปนี้</w:t>
+      </w:r>
+    </w:p>
+    <w:p>
+      <w:pPr>
+        <w:rPr>
+          <w:rFonts w:ascii="TH Sarabun New" w:hAnsi="TH Sarabun New" w:cs="TH Sarabun New"/>
+          <w:sz w:val="36"/>
+          <w:szCs w:val="36"/>
+        </w:rPr>
+      </w:pPr>
+      <w:r>
+        <w:rPr>
+          <w:rFonts w:ascii="TH Sarabun New" w:hAnsi="TH Sarabun New" w:cs="TH Sarabun New"/>
+          <w:sz w:val="36"/>
+          <w:szCs w:val="36"/>
+          <w:cs/>
+        </w:rPr>
+        <w:t>(ก) กรณีเป็นผู้กู้ยืมเงินรายใหม่ ไม่กำหนดจำนวนชั่วโมง</w:t>
+      </w:r>
+    </w:p>
+    <w:p>
+      <w:pPr>
+        <w:rPr>
+          <w:rFonts w:ascii="TH Sarabun New" w:hAnsi="TH Sarabun New" w:cs="TH Sarabun New"/>
+          <w:sz w:val="36"/>
+          <w:szCs w:val="36"/>
+        </w:rPr>
+      </w:pPr>
+      <w:r>
+        <w:rPr>
+          <w:rFonts w:ascii="TH Sarabun New" w:hAnsi="TH Sarabun New" w:cs="TH Sarabun New"/>
+          <w:sz w:val="36"/>
+          <w:szCs w:val="36"/>
+          <w:cs/>
+        </w:rPr>
+        <w:t>(ข) กรณีเป็นผู้กู้ยืมเงินรายเก่าเปลี่ยนระดับการศึกษาที่ศึกษาในระดับประกาศนียบัตรวิชาชีพเทคนิค (</w:t>
+      </w:r>
+      <w:proofErr w:type="spellStart"/>
+      <w:r>
+        <w:rPr>
+          <w:rFonts w:ascii="TH Sarabun New" w:hAnsi="TH Sarabun New" w:cs="TH Sarabun New"/>
+          <w:sz w:val="36"/>
+          <w:szCs w:val="36"/>
+          <w:cs/>
+        </w:rPr>
+        <w:t>ปวท</w:t>
+      </w:r>
+      <w:proofErr w:type="spellEnd"/>
+      <w:r>
+        <w:rPr>
+          <w:rFonts w:ascii="TH Sarabun New" w:hAnsi="TH Sarabun New" w:cs="TH Sarabun New"/>
+          <w:sz w:val="36"/>
+          <w:szCs w:val="36"/>
+          <w:cs/>
+        </w:rPr>
+        <w:t>.) ระดับประกาศนียบัตรวิชาชีพชั้นสูง (ปวส.) ระดับอนุปริญญา ระดับปริญญาตรี หรือเทียบเท่า ไม่กำหนดจำนวนชั่วโมง</w:t>
+      </w:r>
+    </w:p>
+    <w:p>
+      <w:pPr>
+        <w:rPr>
+          <w:rFonts w:ascii="TH Sarabun New" w:hAnsi="TH Sarabun New" w:cs="TH Sarabun New"/>
+          <w:sz w:val="36"/>
+          <w:szCs w:val="36"/>
+        </w:rPr>
+      </w:pPr>
+      <w:r>
+        <w:rPr>
+          <w:rFonts w:ascii="TH Sarabun New" w:hAnsi="TH Sarabun New" w:cs="TH Sarabun New"/>
+          <w:sz w:val="36"/>
+          <w:szCs w:val="36"/>
+          <w:cs/>
+        </w:rPr>
+        <w:t>(ค) กรณีเป็นผู้กู้ยืมเงินรายเก่าเลื่อนชั้นปีทุกระดับการศึกษา กำหนดจำนวนไม่น้อยกว่าสามสิบหกชั่วโมง</w:t>
+      </w:r>
+    </w:p>
+    <w:p>
+      <w:pPr>
+        <w:rPr>
+          <w:rFonts w:ascii="TH Sarabun New" w:hAnsi="TH Sarabun New" w:cs="TH Sarabun New"/>
+          <w:sz w:val="36"/>
+          <w:szCs w:val="36"/>
+        </w:rPr>
+      </w:pPr>
+      <w:r>
+        <w:rPr>
+          <w:rFonts w:ascii="TH Sarabun New" w:hAnsi="TH Sarabun New" w:cs="TH Sarabun New"/>
+          <w:sz w:val="36"/>
+          <w:szCs w:val="36"/>
+          <w:cs/>
+        </w:rPr>
+        <w:t>การทำประโยชน์ต่อสังคมหรือสาธารณะตามวรรคหนึ่ง หมายถึง การบำเพ็ญตนให้เป็นประโยชน์ ต่อชุมชน สังคมหรือประเทศชาติในลักษณะอาสาสมัคร เพื่อช่วยขัดเกลาจิตใจให้มีความเมตตากรุณามีความเสียสละ และมีจิตสาธารณะ เพื่อช่วยสร้างสรรค์สังคมหรือสาธารณะให้อยู่ร่วมกันอย่างมีความสุข ซึ่งจะต้องไม่เป็นส่วนหนึ่ง ของการเรียนการสอนและไม่ได้รับค่าตอบแทนในลักษณะการจ้าง</w:t>
+      </w:r>
+    </w:p>
+    <w:p>
+      <w:pPr>
+        <w:ind w:firstLine="720"/>
+        <w:rPr>
+          <w:rFonts w:ascii="TH Sarabun New" w:hAnsi="TH Sarabun New" w:cs="TH Sarabun New"/>
+          <w:sz w:val="36"/>
+          <w:szCs w:val="36"/>
+        </w:rPr>
+      </w:pPr>
+      <w:r>
+        <w:rPr>
+          <w:rFonts w:ascii="TH Sarabun New" w:hAnsi="TH Sarabun New" w:cs="TH Sarabun New"/>
+          <w:sz w:val="36"/>
+          <w:szCs w:val="36"/>
+          <w:cs/>
+        </w:rPr>
+        <w:t>ลักษณะที่ 2 ให้การสนับสนุนและส่งเสริมการศึกษาแก่นักเรียนหรือนักศึกษาที่ศึกษาในสาขาวิชาที่เป็นความต้องการหลัก ซึ่งมีความชัดเจนของการผลิตกำลังคนและมีความจำเป็นต่อการพัฒนาประเทศ กองทุนจะให้กู้ยืมเงินเพื่อเป็นค่าเล่าเรียน และค่าใช้จ่ายที่เกี่ยวเนื่องกับการศึกษา สำหรับการขอกู้ยืมเงินเพื่อเป็นค่าครองชีพ กองทุนจะพิจารณาจากรายได้ต่อครอบครัวของผู้กู้ยืมเงินตามที่กำหนดในข้อ (5)</w:t>
+      </w:r>
+    </w:p>
+    <w:p>
+      <w:pPr>
+        <w:rPr>
+          <w:rFonts w:ascii="TH Sarabun New" w:hAnsi="TH Sarabun New" w:cs="TH Sarabun New"/>
+          <w:sz w:val="36"/>
+          <w:szCs w:val="36"/>
+        </w:rPr>
+      </w:pPr>
+    </w:p>
+    <w:p>
+      <w:pPr>
+        <w:ind w:firstLine="720"/>
+        <w:rPr>
+          <w:rFonts w:ascii="TH Sarabun New" w:hAnsi="TH Sarabun New" w:cs="TH Sarabun New"/>
+          <w:sz w:val="36"/>
+          <w:szCs w:val="36"/>
+        </w:rPr>
+      </w:pPr>
+      <w:r>
+        <w:rPr>
+          <w:rFonts w:ascii="TH Sarabun New" w:hAnsi="TH Sarabun New" w:cs="TH Sarabun New"/>
+          <w:sz w:val="36"/>
+          <w:szCs w:val="36"/>
+          <w:cs/>
+        </w:rPr>
+        <w:t>1. เป็นผู้ที่ศึกษาในสาขาวิชาที่เป็นความต้องการหลักซึ่งมีความชัดเจนของการผลิตกำลังคนและมีความจำเป็นต่อการพัฒนาประเทศตามประกาศคณะกรรมการกองทุนเงินให้กู้ยืมเพื่อการศึกษา</w:t>
+      </w:r>
+    </w:p>
+    <w:p>
+      <w:pPr>
+        <w:ind w:firstLine="720"/>
+        <w:rPr>
+          <w:rFonts w:ascii="TH Sarabun New" w:hAnsi="TH Sarabun New" w:cs="TH Sarabun New"/>
+          <w:sz w:val="36"/>
+          <w:szCs w:val="36"/>
+        </w:rPr>
+      </w:pPr>
+      <w:r>
+        <w:rPr>
+          <w:rFonts w:ascii="TH Sarabun New" w:hAnsi="TH Sarabun New" w:cs="TH Sarabun New"/>
+          <w:sz w:val="36"/>
+          <w:szCs w:val="36"/>
+          <w:cs/>
+        </w:rPr>
+        <w:t>2. เป็นผู้ที่มีอายุไม่เกิน 30 ปีบริบูรณ์ ในปีการศึกษาที่ยื่นคำขอกู้ยืมเงินกองทุนครั้งแรก</w:t>
+      </w:r>
+    </w:p>
+    <w:p>
+      <w:pPr>
+        <w:ind w:firstLine="720"/>
+        <w:rPr>
+          <w:rFonts w:ascii="TH Sarabun New" w:hAnsi="TH Sarabun New" w:cs="TH Sarabun New"/>
+          <w:sz w:val="36"/>
+          <w:szCs w:val="36"/>
+        </w:rPr>
+      </w:pPr>
+      <w:r>
+        <w:rPr>
+          <w:rFonts w:ascii="TH Sarabun New" w:hAnsi="TH Sarabun New" w:cs="TH Sarabun New"/>
+          <w:sz w:val="36"/>
+          <w:szCs w:val="36"/>
+          <w:cs/>
+        </w:rPr>
+        <w:t>3. เป็นผู้ที่เข้าศึกษาในระดับการศึกษาและหลักสูตร/ประเภทวิชาและสาขาวิชา ดังนี้</w:t>
+      </w:r>
+    </w:p>
+    <w:p>
+      <w:pPr>
+        <w:rPr>
+          <w:rFonts w:ascii="TH Sarabun New" w:hAnsi="TH Sarabun New" w:cs="TH Sarabun New"/>
+          <w:sz w:val="36"/>
+          <w:szCs w:val="36"/>
+        </w:rPr>
+      </w:pPr>
+      <w:r>
+        <w:rPr>
+          <w:rFonts w:ascii="TH Sarabun New" w:hAnsi="TH Sarabun New" w:cs="TH Sarabun New"/>
+          <w:sz w:val="36"/>
+          <w:szCs w:val="36"/>
+          <w:cs/>
+        </w:rPr>
+        <w:t>(ก) ระดับประกาศนียบัตรวิชาชีพ (ปวช.) ระดับประกาศนียบัตรวิชาชีพเทคนิค (</w:t>
+      </w:r>
+      <w:proofErr w:type="spellStart"/>
+      <w:r>
+        <w:rPr>
+          <w:rFonts w:ascii="TH Sarabun New" w:hAnsi="TH Sarabun New" w:cs="TH Sarabun New"/>
+          <w:sz w:val="36"/>
+          <w:szCs w:val="36"/>
+          <w:cs/>
+        </w:rPr>
+        <w:t>ปวท</w:t>
+      </w:r>
+      <w:proofErr w:type="spellEnd"/>
+      <w:r>
+        <w:rPr>
+          <w:rFonts w:ascii="TH Sarabun New" w:hAnsi="TH Sarabun New" w:cs="TH Sarabun New"/>
+          <w:sz w:val="36"/>
+          <w:szCs w:val="36"/>
+          <w:cs/>
+        </w:rPr>
+        <w:t>.) ระดับประกาศนียบัตรวิชาชีพชั้นสูง (ปวส.) ระดับอนุปริญญา ระดับปริญญาตรี หรือเทียบเท่า</w:t>
+      </w:r>
+    </w:p>
+    <w:p>
+      <w:pPr>
+        <w:rPr>
+          <w:rFonts w:ascii="TH Sarabun New" w:hAnsi="TH Sarabun New" w:cs="TH Sarabun New"/>
+          <w:sz w:val="36"/>
+          <w:szCs w:val="36"/>
+        </w:rPr>
+      </w:pPr>
+      <w:r>
+        <w:rPr>
+          <w:rFonts w:ascii="TH Sarabun New" w:hAnsi="TH Sarabun New" w:cs="TH Sarabun New"/>
+          <w:sz w:val="36"/>
+          <w:szCs w:val="36"/>
+          <w:cs/>
+        </w:rPr>
+        <w:t>(ข) หลักสูตร/ประเภทวิชาและสาขาวิชาเป็นไปตามประกาศที่คณะกรรมการกำหนด</w:t>
+      </w:r>
+    </w:p>
+    <w:p>
+      <w:pPr>
+        <w:ind w:firstLine="720"/>
+        <w:rPr>
+          <w:rFonts w:ascii="TH Sarabun New" w:hAnsi="TH Sarabun New" w:cs="TH Sarabun New"/>
+          <w:sz w:val="36"/>
+          <w:szCs w:val="36"/>
+        </w:rPr>
+      </w:pPr>
+      <w:r>
+        <w:rPr>
+          <w:rFonts w:ascii="TH Sarabun New" w:hAnsi="TH Sarabun New" w:cs="TH Sarabun New"/>
+          <w:sz w:val="36"/>
+          <w:szCs w:val="36"/>
+          <w:cs/>
+        </w:rPr>
+        <w:t>4. เป็นผู้ที่ทำประโยชน์ต่อสังคมหรือสาธารณะในระหว่างปีการศึกษาก่อนหน้าปีการศึกษาที่จะขอ กู้ยืมเงิน โดยมีหลักฐานการเข้าร่วมโครงการ/กิจกรรมที่มีประโยชน์ต่อสังคมหรือสาธารณะที่น่าเชื่อถือตามจำนวนชั่วโมงที่กำหนดสำหรับผู้ขอกู้ยืมเงินแต่ละกลุ่ม ดังต่อไปนี้</w:t>
+      </w:r>
+    </w:p>
+    <w:p>
+      <w:pPr>
+        <w:rPr>
+          <w:rFonts w:ascii="TH Sarabun New" w:hAnsi="TH Sarabun New" w:cs="TH Sarabun New"/>
+          <w:sz w:val="36"/>
+          <w:szCs w:val="36"/>
+        </w:rPr>
+      </w:pPr>
+      <w:r>
+        <w:rPr>
+          <w:rFonts w:ascii="TH Sarabun New" w:hAnsi="TH Sarabun New" w:cs="TH Sarabun New"/>
+          <w:sz w:val="36"/>
+          <w:szCs w:val="36"/>
+          <w:cs/>
+        </w:rPr>
+        <w:t>(ก) กรณีเป็นผู้กู้ยืมเงินรายใหม่ ไม่กำหนดจำนวนชั่วโมง</w:t>
+      </w:r>
+    </w:p>
+    <w:p>
+      <w:pPr>
+        <w:rPr>
+          <w:rFonts w:ascii="TH Sarabun New" w:hAnsi="TH Sarabun New" w:cs="TH Sarabun New"/>
+          <w:sz w:val="36"/>
+          <w:szCs w:val="36"/>
+        </w:rPr>
+      </w:pPr>
+      <w:r>
+        <w:rPr>
+          <w:rFonts w:ascii="TH Sarabun New" w:hAnsi="TH Sarabun New" w:cs="TH Sarabun New"/>
+          <w:sz w:val="36"/>
+          <w:szCs w:val="36"/>
+          <w:cs/>
+        </w:rPr>
+        <w:t>(ข) กรณีเป็นผู้กู้ยืมเงินรายเก่าเปลี่ยนระดับการศึกษาที่ศึกษาในระดับประกาศนียบัตรวิชาชีพเทคนิค (</w:t>
+      </w:r>
+      <w:proofErr w:type="spellStart"/>
+      <w:r>
+        <w:rPr>
+          <w:rFonts w:ascii="TH Sarabun New" w:hAnsi="TH Sarabun New" w:cs="TH Sarabun New"/>
+          <w:sz w:val="36"/>
+          <w:szCs w:val="36"/>
+          <w:cs/>
+        </w:rPr>
+        <w:t>ปวท</w:t>
+      </w:r>
+      <w:proofErr w:type="spellEnd"/>
+      <w:r>
+        <w:rPr>
+          <w:rFonts w:ascii="TH Sarabun New" w:hAnsi="TH Sarabun New" w:cs="TH Sarabun New"/>
+          <w:sz w:val="36"/>
+          <w:szCs w:val="36"/>
+          <w:cs/>
+        </w:rPr>
+        <w:t>.) ระดับประกาศนียบัตรวิชาชีพชั้นสูง (ปวส.) ระดับอนุปริญญา ระดับปริญญาตรี หรือเทียบเท่าไม่กำหนดจำนวนชั่วโมง</w:t>
+      </w:r>
+    </w:p>
+    <w:p>
+      <w:pPr>
+        <w:rPr>
+          <w:rFonts w:ascii="TH Sarabun New" w:hAnsi="TH Sarabun New" w:cs="TH Sarabun New"/>
+          <w:sz w:val="36"/>
+          <w:szCs w:val="36"/>
+        </w:rPr>
+      </w:pPr>
+      <w:r>
+        <w:rPr>
+          <w:rFonts w:ascii="TH Sarabun New" w:hAnsi="TH Sarabun New" w:cs="TH Sarabun New"/>
+          <w:sz w:val="36"/>
+          <w:szCs w:val="36"/>
+          <w:cs/>
+        </w:rPr>
+        <w:t>(ค) กรณีเป็นผู้กู้ยืมเงินรายเก่าเลื่อนชั้นปีทุกระดับการศึกษา กำหนดจำนวนไม่น้อยกว่าสามสิบหกชั่วโมง</w:t>
+      </w:r>
+    </w:p>
+    <w:p>
+      <w:pPr>
+        <w:rPr>
+          <w:rFonts w:ascii="TH Sarabun New" w:hAnsi="TH Sarabun New" w:cs="TH Sarabun New"/>
+          <w:sz w:val="36"/>
+          <w:szCs w:val="36"/>
+        </w:rPr>
+      </w:pPr>
+      <w:r>
+        <w:rPr>
+          <w:rFonts w:ascii="TH Sarabun New" w:hAnsi="TH Sarabun New" w:cs="TH Sarabun New"/>
+          <w:sz w:val="36"/>
+          <w:szCs w:val="36"/>
+          <w:cs/>
+        </w:rPr>
+        <w:t>การทำประโยชน์ต่อสังคมหรือสาธารณะตามวรรคหนึ่ง หมายถึง การบำเพ็ญตนให้เป็นประโยชน์ ต่อชุมชน สังคมหรือประเทศชาติในลักษณะอาสาสมัคร เพื่อช่วยขัดเกลาจิตใจให้มีความเมตตากรุณามีความเสียสละ และมีจิตสาธารณะ เพื่อช่วยสร้างสรรค์สังคมหรือสาธารณะให้อยู่ร่วมกันอย่างมีความสุข ซึ่งจะต้องไม่เป็นส่วนหนึ่ง ของการเรียนการสอนและไม่ได้รับค่าตอบแทนในลักษณะการจ้าง</w:t>
+      </w:r>
+    </w:p>
+    <w:p>
+      <w:pPr>
+        <w:rPr>
+          <w:rFonts w:ascii="TH Sarabun New" w:hAnsi="TH Sarabun New" w:cs="TH Sarabun New"/>
+          <w:sz w:val="36"/>
+          <w:szCs w:val="36"/>
+        </w:rPr>
+      </w:pPr>
+    </w:p>
+    <w:p>
+      <w:pPr>
+        <w:ind w:firstLine="720"/>
+        <w:rPr>
+          <w:rFonts w:ascii="TH Sarabun New" w:hAnsi="TH Sarabun New" w:cs="TH Sarabun New"/>
+          <w:sz w:val="36"/>
+          <w:szCs w:val="36"/>
+        </w:rPr>
+      </w:pPr>
+      <w:r>
+        <w:rPr>
+          <w:rFonts w:ascii="TH Sarabun New" w:hAnsi="TH Sarabun New" w:cs="TH Sarabun New"/>
+          <w:sz w:val="36"/>
+          <w:szCs w:val="36"/>
+          <w:cs/>
+        </w:rPr>
+        <w:t>5. นักเรียนหรือนักศึกษา หากประสงค์จะกู้ยืมเงินค่าครองชีพจะต้องเป็นผู้ที่มีรายได้ต่อครอบครัว ไม่เกินสามแสนหกหมื่นบาทต่อปี ทั้งนี้ รายได้ต่อครอบครัวให้พิจารณาจากหลักเกณฑ์ข้อใดข้อหนึ่ง ดังนี้</w:t>
+      </w:r>
+    </w:p>
+    <w:p>
+      <w:pPr>
+        <w:rPr>
+          <w:rFonts w:ascii="TH Sarabun New" w:hAnsi="TH Sarabun New" w:cs="TH Sarabun New"/>
+          <w:sz w:val="36"/>
+          <w:szCs w:val="36"/>
+        </w:rPr>
+      </w:pPr>
+      <w:r>
+        <w:rPr>
+          <w:rFonts w:ascii="TH Sarabun New" w:hAnsi="TH Sarabun New" w:cs="TH Sarabun New"/>
+          <w:sz w:val="36"/>
+          <w:szCs w:val="36"/>
+          <w:cs/>
+        </w:rPr>
+        <w:t>(ก) รายได้รวมของนักเรียนหรือนักศึกษาผู้ขอกู้ยืมเงิน รวมกับรายได้ของบิดามารดา ในกรณีที่ บิดา มารดาเป็นผู้ใช้อำนาจปกครอง</w:t>
+      </w:r>
+    </w:p>
+    <w:p>
+      <w:pPr>
+        <w:rPr>
+          <w:rFonts w:ascii="TH Sarabun New" w:hAnsi="TH Sarabun New" w:cs="TH Sarabun New"/>
+          <w:sz w:val="36"/>
+          <w:szCs w:val="36"/>
+        </w:rPr>
+      </w:pPr>
+      <w:r>
+        <w:rPr>
+          <w:rFonts w:ascii="TH Sarabun New" w:hAnsi="TH Sarabun New" w:cs="TH Sarabun New"/>
+          <w:sz w:val="36"/>
+          <w:szCs w:val="36"/>
+          <w:cs/>
+        </w:rPr>
+        <w:t>(ข) รายได้รวมของนักเรียนหรือนักศึกษาผู้ขอกู้ยืมเงิน รวมกับรายได้ของผู้ปกครอง ในกรณีที่ ผู้ใช้อำนาจปกครองมิใช่บิดา มารดา</w:t>
+      </w:r>
+    </w:p>
+    <w:p>
+      <w:pPr>
+        <w:rPr>
+          <w:rFonts w:ascii="TH Sarabun New" w:hAnsi="TH Sarabun New" w:cs="TH Sarabun New"/>
+          <w:sz w:val="36"/>
+          <w:szCs w:val="36"/>
+        </w:rPr>
+      </w:pPr>
+      <w:r>
+        <w:rPr>
+          <w:rFonts w:ascii="TH Sarabun New" w:hAnsi="TH Sarabun New" w:cs="TH Sarabun New"/>
+          <w:sz w:val="36"/>
+          <w:szCs w:val="36"/>
+          <w:cs/>
+        </w:rPr>
+        <w:t>(ค) รายได้รวมของนักเรียนหรือนักศึกษาผู้ขอกู้ยืมเงิน รวมกับรายได้ของคู่สมรส ในกรณีผู้ขอกู้ยืมเงินได้ทำการสมรสแล้ว</w:t>
+      </w:r>
+    </w:p>
+    <w:p>
+      <w:pPr>
+        <w:rPr>
+          <w:rFonts w:ascii="TH Sarabun New" w:hAnsi="TH Sarabun New" w:cs="TH Sarabun New"/>
+          <w:sz w:val="36"/>
+          <w:szCs w:val="36"/>
+        </w:rPr>
+      </w:pPr>
+      <w:r>
+        <w:rPr>
+          <w:rFonts w:ascii="TH Sarabun New" w:hAnsi="TH Sarabun New" w:cs="TH Sarabun New"/>
+          <w:sz w:val="36"/>
+          <w:szCs w:val="36"/>
+          <w:cs/>
+        </w:rPr>
+        <w:t xml:space="preserve">หลักเกณฑ์และวิธีการตรวจสอบว่านักเรียนหรือนักศึกษาเป็นผู้ที่มีรายได้ต่อครอบครัวไม่เกิน  </w:t>
+      </w:r>
+      <w:r>
+        <w:rPr>
+          <w:rFonts w:ascii="TH Sarabun New" w:hAnsi="TH Sarabun New" w:cs="TH Sarabun New"/>
+          <w:sz w:val="36"/>
+          <w:szCs w:val="36"/>
+        </w:rPr>
+        <w:t>360,000</w:t>
+      </w:r>
+      <w:r>
+        <w:rPr>
+          <w:rFonts w:ascii="TH Sarabun New" w:hAnsi="TH Sarabun New" w:cs="TH Sarabun New"/>
+          <w:sz w:val="36"/>
+          <w:szCs w:val="36"/>
+        </w:rPr>
+        <w:t xml:space="preserve"> </w:t>
+      </w:r>
+      <w:r>
+        <w:rPr>
+          <w:rFonts w:ascii="TH Sarabun New" w:hAnsi="TH Sarabun New" w:cs="TH Sarabun New"/>
+          <w:sz w:val="36"/>
+          <w:szCs w:val="36"/>
+          <w:cs/>
+        </w:rPr>
+        <w:t>ต่อปีหรือไม่ ให้เป็นไปตามที่กองทุนกำหนด</w:t>
+      </w:r>
+    </w:p>
+    <w:p>
+      <w:pPr>
+        <w:rPr>
+          <w:rFonts w:ascii="TH Sarabun New" w:hAnsi="TH Sarabun New" w:cs="TH Sarabun New"/>
+          <w:sz w:val="36"/>
+          <w:szCs w:val="36"/>
+        </w:rPr>
+      </w:pPr>
+      <w:r>
+        <w:rPr>
+          <w:rFonts w:ascii="TH Sarabun New" w:hAnsi="TH Sarabun New" w:cs="TH Sarabun New"/>
+          <w:sz w:val="36"/>
+          <w:szCs w:val="36"/>
+          <w:cs/>
+        </w:rPr>
+        <w:tab/>
+      </w:r>
+      <w:r>
+        <w:rPr>
           <w:rFonts w:ascii="TH Sarabun New" w:hAnsi="TH Sarabun New" w:cs="TH Sarabun New" w:hint="cs"/>
           <w:sz w:val="36"/>
           <w:szCs w:val="36"/>
-        </w:rPr>
-      </w:pPr>
-      <w:r>
-        <w:rPr>
-          <w:rFonts w:ascii="TH Sarabun New" w:hAnsi="TH Sarabun New" w:cs="TH Sarabun New"/>
-          <w:sz w:val="36"/>
-          <w:szCs w:val="36"/>
-          <w:cs/>
-        </w:rPr>
-        <w:t>(ข) หลักสูตร/ประเภทวิชาและสาขาวิชาเป็นไปตามประกาศที่คณะกรรมการกำหนด</w:t>
-      </w:r>
-    </w:p>
-    <w:p>
-      <w:pPr>
-        <w:ind w:firstLine="720"/>
-        <w:rPr>
-          <w:rFonts w:ascii="TH Sarabun New" w:hAnsi="TH Sarabun New" w:cs="TH Sarabun New" w:hint="cs"/>
-          <w:sz w:val="36"/>
-          <w:szCs w:val="36"/>
-        </w:rPr>
-      </w:pPr>
-      <w:r>
-        <w:rPr>
-          <w:rFonts w:ascii="TH Sarabun New" w:hAnsi="TH Sarabun New" w:cs="TH Sarabun New"/>
-          <w:sz w:val="36"/>
-          <w:szCs w:val="36"/>
-          <w:cs/>
-        </w:rPr>
-        <w:t>4. เป็นผู้ที่ทำประโยชน์ต่อสังคมหรือสาธารณะในระหว่างปีการศึกษาก่อนหน้าปีการศึกษาที่จะขอ กู้ยืมเงิน โดยมีหลักฐานการเข้าร่วมโครงการ/กิจกรรมที่มีประโยชน์ต่อสังคม หรือสาธารณะที่น่าเชื่อถือตามจำนวนชั่วโมงที่กำหนดสำหรับผู้ขอกู้ยืมเงินแต่ละกลุ่ม ดังต่อไปนี้</w:t>
-      </w:r>
-    </w:p>
-    <w:p>
-      <w:pPr>
-        <w:rPr>
-          <w:rFonts w:ascii="TH Sarabun New" w:hAnsi="TH Sarabun New" w:cs="TH Sarabun New" w:hint="cs"/>
-          <w:sz w:val="36"/>
-          <w:szCs w:val="36"/>
-        </w:rPr>
-      </w:pPr>
-      <w:r>
-        <w:rPr>
-          <w:rFonts w:ascii="TH Sarabun New" w:hAnsi="TH Sarabun New" w:cs="TH Sarabun New"/>
-          <w:sz w:val="36"/>
-          <w:szCs w:val="36"/>
-          <w:cs/>
-        </w:rPr>
-        <w:t>(ก) กรณีเป็นผู้กู้ยืมเงินรายใหม่ ไม่กำหนดจำนวนชั่วโมง</w:t>
-      </w:r>
-    </w:p>
-    <w:p>
-      <w:pPr>
-        <w:rPr>
-          <w:rFonts w:ascii="TH Sarabun New" w:hAnsi="TH Sarabun New" w:cs="TH Sarabun New" w:hint="cs"/>
-          <w:sz w:val="36"/>
-          <w:szCs w:val="36"/>
-        </w:rPr>
-      </w:pPr>
-      <w:r>
-        <w:rPr>
-          <w:rFonts w:ascii="TH Sarabun New" w:hAnsi="TH Sarabun New" w:cs="TH Sarabun New"/>
-          <w:sz w:val="36"/>
-          <w:szCs w:val="36"/>
-          <w:cs/>
-        </w:rPr>
-        <w:t>(ข) กรณีเป็นผู้กู้ยืมเงินรายเก่าเปลี่ยนระดับการศึกษาที่ศึกษาในระดับประกาศนียบัตรวิชาชีพเทคนิค (</w:t>
-      </w:r>
-      <w:proofErr w:type="spellStart"/>
-      <w:r>
-        <w:rPr>
-          <w:rFonts w:ascii="TH Sarabun New" w:hAnsi="TH Sarabun New" w:cs="TH Sarabun New"/>
-          <w:sz w:val="36"/>
-          <w:szCs w:val="36"/>
-          <w:cs/>
-        </w:rPr>
-        <w:t>ปวท</w:t>
-      </w:r>
-      <w:proofErr w:type="spellEnd"/>
-      <w:r>
-        <w:rPr>
-          <w:rFonts w:ascii="TH Sarabun New" w:hAnsi="TH Sarabun New" w:cs="TH Sarabun New"/>
-          <w:sz w:val="36"/>
-          <w:szCs w:val="36"/>
-          <w:cs/>
-        </w:rPr>
-        <w:t>.) ระดับประกาศนียบัตรวิชาชีพชั้นสูง (ปวส.) ระดับอนุปริญญา ระดับปริญญาตรี หรือเทียบเท่า ไม่กำหนดจำนวนชั่วโมง</w:t>
-      </w:r>
-    </w:p>
-    <w:p>
-      <w:pPr>
-        <w:rPr>
-          <w:rFonts w:ascii="TH Sarabun New" w:hAnsi="TH Sarabun New" w:cs="TH Sarabun New" w:hint="cs"/>
-          <w:sz w:val="36"/>
-          <w:szCs w:val="36"/>
-        </w:rPr>
-      </w:pPr>
-      <w:r>
-        <w:rPr>
-          <w:rFonts w:ascii="TH Sarabun New" w:hAnsi="TH Sarabun New" w:cs="TH Sarabun New"/>
-          <w:sz w:val="36"/>
-          <w:szCs w:val="36"/>
-          <w:cs/>
-        </w:rPr>
-        <w:t>(ค) กรณีเป็นผู้กู้ยืมเงินรายเก่าเลื่อนชั้นปีทุกระดับการศึกษา กำหนดจำนวนไม่น้อยกว่าสามสิบหกชั่วโมง</w:t>
-      </w:r>
-    </w:p>
-    <w:p>
-      <w:pPr>
-        <w:rPr>
-          <w:rFonts w:ascii="TH Sarabun New" w:hAnsi="TH Sarabun New" w:cs="TH Sarabun New"/>
-          <w:sz w:val="36"/>
-          <w:szCs w:val="36"/>
-        </w:rPr>
-      </w:pPr>
-      <w:r>
-        <w:rPr>
-          <w:rFonts w:ascii="TH Sarabun New" w:hAnsi="TH Sarabun New" w:cs="TH Sarabun New"/>
-          <w:sz w:val="36"/>
-          <w:szCs w:val="36"/>
-          <w:cs/>
-        </w:rPr>
-        <w:t>การทำประโยชน์ต่อสังคมหรือสาธารณะตามวรรคหนึ่ง หมายถึง การบำเพ็ญตนให้เป็นประโยชน์ ต่อชุมชน สังคมหรือประเทศชาติในลักษณะอาสาสมัคร เพื่อช่วยขัดเกลาจิตใจให้มีความเมตตากรุณามีความเสียสละ และมีจิตสาธารณะ เพื่อช่วยสร้างสรรค์สังคมหรือสาธารณะให้อยู่ร่วมกันอย่างมีความสุข ซึ่งจะต้องไม่เป็นส่วนหนึ่ง ของการเรียนการสอนและไม่ได้รับค่าตอบแทนในลักษณะการจ้าง</w:t>
-      </w:r>
-    </w:p>
-    <w:p>
-      <w:pPr>
-        <w:ind w:firstLine="720"/>
-        <w:rPr>
-          <w:rFonts w:ascii="TH Sarabun New" w:hAnsi="TH Sarabun New" w:cs="TH Sarabun New"/>
-          <w:sz w:val="36"/>
-          <w:szCs w:val="36"/>
-        </w:rPr>
-      </w:pPr>
-      <w:r>
-        <w:rPr>
-          <w:rFonts w:ascii="TH Sarabun New" w:hAnsi="TH Sarabun New" w:cs="TH Sarabun New"/>
-          <w:sz w:val="36"/>
-          <w:szCs w:val="36"/>
-          <w:cs/>
-        </w:rPr>
-        <w:t>ลักษณะที่ 2 ให้การสนับสนุนและส่งเสริมการศึกษาแก่นักเรียนหรือนักศึกษาที่ศึกษาในสาขาวิชาที่เป็นความต้องการหลัก ซึ่งมีความชัดเจนของการผลิตกำลังคนและมีความจำเป็นต่อการพัฒนาประเทศ กองทุนจะให้กู้ยืมเงินเพื่อเป็นค่าเล่าเรียน และค่าใช้จ่ายที่เกี่ยวเนื่องกับการศึกษา สำหรับการขอกู้ยืมเงินเพื่อเป็นค่าครองชีพ กองทุนจะพิจารณาจากรายได้ต่อครอบครัวของผู้กู้ยืมเงินตามที่กำหนดในข้อ (5)</w:t>
-      </w:r>
-    </w:p>
-    <w:p>
-      <w:pPr>
-        <w:rPr>
-          <w:rFonts w:ascii="TH Sarabun New" w:hAnsi="TH Sarabun New" w:cs="TH Sarabun New"/>
-          <w:sz w:val="36"/>
-          <w:szCs w:val="36"/>
-        </w:rPr>
-      </w:pPr>
-    </w:p>
-    <w:p>
-      <w:pPr>
-        <w:ind w:firstLine="720"/>
-        <w:rPr>
-          <w:rFonts w:ascii="TH Sarabun New" w:hAnsi="TH Sarabun New" w:cs="TH Sarabun New" w:hint="cs"/>
-          <w:sz w:val="36"/>
-          <w:szCs w:val="36"/>
-        </w:rPr>
-      </w:pPr>
-      <w:r>
-        <w:rPr>
-          <w:rFonts w:ascii="TH Sarabun New" w:hAnsi="TH Sarabun New" w:cs="TH Sarabun New"/>
-          <w:sz w:val="36"/>
-          <w:szCs w:val="36"/>
-          <w:cs/>
-        </w:rPr>
-        <w:t>1. เป็นผู้ที่ศึกษาในสาขาวิชาที่เป็นความต้องการหลักซึ่งมีความชัดเจนของการผลิตกำลังคนและมีความจำเป็นต่อการพัฒนาประเทศตามประกาศคณะกรรมการกองทุนเงินให้กู้ยืมเพื่อการศึกษา</w:t>
-      </w:r>
-    </w:p>
-    <w:p>
-      <w:pPr>
-        <w:ind w:firstLine="720"/>
-        <w:rPr>
-          <w:rFonts w:ascii="TH Sarabun New" w:hAnsi="TH Sarabun New" w:cs="TH Sarabun New" w:hint="cs"/>
+          <w:cs/>
+        </w:rPr>
+        <w:t>ลั</w:t>
+      </w:r>
+      <w:r>
+        <w:rPr>
+          <w:rFonts w:ascii="TH Sarabun New" w:hAnsi="TH Sarabun New" w:cs="TH Sarabun New"/>
+          <w:sz w:val="36"/>
+          <w:szCs w:val="36"/>
+          <w:cs/>
+        </w:rPr>
+        <w:t>กษณะที่ 3 ให้การสนับสนุนและส่งเสริมการศึกษาแก่นักเรียนหรือนักศึกษาที่ศึกษาในสาขาวิชาขาดแคลนหรือสาขาวิชาที่กองทุนมุ่งส่งเสริมเป็นพิเศษ กองทุนจะให้กู้ยืมเงินเพื่อเป็นค่าเล่าเรียนและค่าใช้จ่าย ที่เกี่ยวเนื่องกับการศึกษา สำหรับการขอกู้ยืมเงินเพื่อเป็นค่าครองชีพ กองทุนจะพิจารณาจากรายได้ต่อครอบครัว ของผู้กู้ยืมเงินตามที่กำหนดในข้อ (5)</w:t>
+      </w:r>
+    </w:p>
+    <w:p>
+      <w:pPr>
+        <w:ind w:firstLine="720"/>
+        <w:rPr>
+          <w:rFonts w:ascii="TH Sarabun New" w:hAnsi="TH Sarabun New" w:cs="TH Sarabun New"/>
+          <w:sz w:val="36"/>
+          <w:szCs w:val="36"/>
+        </w:rPr>
+      </w:pPr>
+      <w:r>
+        <w:rPr>
+          <w:rFonts w:ascii="TH Sarabun New" w:hAnsi="TH Sarabun New" w:cs="TH Sarabun New"/>
+          <w:sz w:val="36"/>
+          <w:szCs w:val="36"/>
+          <w:cs/>
+        </w:rPr>
+        <w:t>1. เป็นผู้ที่ศึกษาในสาขาวิชาขาดแคลนหรือสาขาวิชาที่กองทุนมุ่งส่งเสริมเป็นพิเศษ ตามประกาศคณะกรรมการกองทุนเงินให้กู้ยืมเพื่อการศึกษา</w:t>
+      </w:r>
+    </w:p>
+    <w:p>
+      <w:pPr>
+        <w:ind w:firstLine="720"/>
+        <w:rPr>
+          <w:rFonts w:ascii="TH Sarabun New" w:hAnsi="TH Sarabun New" w:cs="TH Sarabun New"/>
           <w:sz w:val="36"/>
           <w:szCs w:val="36"/>
         </w:rPr>
@@ -940,7 +1333,7 @@
       <w:pPr>
         <w:ind w:firstLine="720"/>
         <w:rPr>
-          <w:rFonts w:ascii="TH Sarabun New" w:hAnsi="TH Sarabun New" w:cs="TH Sarabun New" w:hint="cs"/>
+          <w:rFonts w:ascii="TH Sarabun New" w:hAnsi="TH Sarabun New" w:cs="TH Sarabun New"/>
           <w:sz w:val="36"/>
           <w:szCs w:val="36"/>
         </w:rPr>
@@ -958,376 +1351,16 @@
     <w:p>
       <w:pPr>
         <w:rPr>
-          <w:rFonts w:ascii="TH Sarabun New" w:hAnsi="TH Sarabun New" w:cs="TH Sarabun New" w:hint="cs"/>
-          <w:sz w:val="36"/>
-          <w:szCs w:val="36"/>
-        </w:rPr>
-      </w:pPr>
-      <w:r>
-        <w:rPr>
-          <w:rFonts w:ascii="TH Sarabun New" w:hAnsi="TH Sarabun New" w:cs="TH Sarabun New"/>
-          <w:sz w:val="36"/>
-          <w:szCs w:val="36"/>
-          <w:cs/>
-        </w:rPr>
-        <w:t>(ก) ระดับประกาศนียบัตรวิชาชีพ (ปวช.) ระดับประกาศนียบัตรวิชาชีพเทคนิค (</w:t>
-      </w:r>
-      <w:proofErr w:type="spellStart"/>
-      <w:r>
-        <w:rPr>
-          <w:rFonts w:ascii="TH Sarabun New" w:hAnsi="TH Sarabun New" w:cs="TH Sarabun New"/>
-          <w:sz w:val="36"/>
-          <w:szCs w:val="36"/>
-          <w:cs/>
-        </w:rPr>
-        <w:t>ปวท</w:t>
-      </w:r>
-      <w:proofErr w:type="spellEnd"/>
-      <w:r>
-        <w:rPr>
-          <w:rFonts w:ascii="TH Sarabun New" w:hAnsi="TH Sarabun New" w:cs="TH Sarabun New"/>
-          <w:sz w:val="36"/>
-          <w:szCs w:val="36"/>
-          <w:cs/>
-        </w:rPr>
-        <w:t>.) ระดับประกาศนียบัตรวิชาชีพชั้นสูง (ปวส.) ระดับอนุปริญญา ระดับปริญญาตรี หรือเทียบเท่า</w:t>
-      </w:r>
-    </w:p>
-    <w:p>
-      <w:pPr>
-        <w:rPr>
-          <w:rFonts w:ascii="TH Sarabun New" w:hAnsi="TH Sarabun New" w:cs="TH Sarabun New" w:hint="cs"/>
-          <w:sz w:val="36"/>
-          <w:szCs w:val="36"/>
-        </w:rPr>
-      </w:pPr>
-      <w:r>
-        <w:rPr>
-          <w:rFonts w:ascii="TH Sarabun New" w:hAnsi="TH Sarabun New" w:cs="TH Sarabun New"/>
-          <w:sz w:val="36"/>
-          <w:szCs w:val="36"/>
-          <w:cs/>
-        </w:rPr>
-        <w:t>(ข) หลักสูตร/ประเภทวิชาและสาขาวิชาเป็นไปตามประกาศที่คณะกรรมการกำหนด</w:t>
-      </w:r>
-    </w:p>
-    <w:p>
-      <w:pPr>
-        <w:ind w:firstLine="720"/>
-        <w:rPr>
-          <w:rFonts w:ascii="TH Sarabun New" w:hAnsi="TH Sarabun New" w:cs="TH Sarabun New" w:hint="cs"/>
-          <w:sz w:val="36"/>
-          <w:szCs w:val="36"/>
-        </w:rPr>
-      </w:pPr>
-      <w:r>
-        <w:rPr>
-          <w:rFonts w:ascii="TH Sarabun New" w:hAnsi="TH Sarabun New" w:cs="TH Sarabun New"/>
-          <w:sz w:val="36"/>
-          <w:szCs w:val="36"/>
-          <w:cs/>
-        </w:rPr>
-        <w:t>4. เป็นผู้ที่ทำประโยชน์ต่อสังคมหรือสาธารณะในระหว่างปีการศึกษาก่อนหน้าปีการศึกษาที่จะขอ กู้ยืมเงิน โดยมีหลักฐานการเข้าร่วมโครงการ/กิจกรรมที่มีประโยชน์ต่อสังคมหรือสาธารณะที่น่าเชื่อถือตามจำนวนชั่วโมงที่กำหนดสำหรับผู้ขอกู้ยืมเงินแต่ละกลุ่ม ดังต่อไปนี้</w:t>
-      </w:r>
-    </w:p>
-    <w:p>
-      <w:pPr>
-        <w:rPr>
-          <w:rFonts w:ascii="TH Sarabun New" w:hAnsi="TH Sarabun New" w:cs="TH Sarabun New" w:hint="cs"/>
-          <w:sz w:val="36"/>
-          <w:szCs w:val="36"/>
-        </w:rPr>
-      </w:pPr>
-      <w:r>
-        <w:rPr>
-          <w:rFonts w:ascii="TH Sarabun New" w:hAnsi="TH Sarabun New" w:cs="TH Sarabun New"/>
-          <w:sz w:val="36"/>
-          <w:szCs w:val="36"/>
-          <w:cs/>
-        </w:rPr>
-        <w:t>(ก) กรณีเป็นผู้กู้ยืมเงินรายใหม่ ไม่กำหนดจำนวนชั่วโมง</w:t>
-      </w:r>
-    </w:p>
-    <w:p>
-      <w:pPr>
-        <w:rPr>
-          <w:rFonts w:ascii="TH Sarabun New" w:hAnsi="TH Sarabun New" w:cs="TH Sarabun New" w:hint="cs"/>
-          <w:sz w:val="36"/>
-          <w:szCs w:val="36"/>
-        </w:rPr>
-      </w:pPr>
-      <w:r>
-        <w:rPr>
-          <w:rFonts w:ascii="TH Sarabun New" w:hAnsi="TH Sarabun New" w:cs="TH Sarabun New"/>
-          <w:sz w:val="36"/>
-          <w:szCs w:val="36"/>
-          <w:cs/>
-        </w:rPr>
-        <w:t>(ข) กรณีเป็นผู้กู้ยืมเงินรายเก่าเปลี่ยนระดับการศึกษาที่ศึกษาในระดับประกาศนียบัตรวิชาชีพเทคนิค (</w:t>
-      </w:r>
-      <w:proofErr w:type="spellStart"/>
-      <w:r>
-        <w:rPr>
-          <w:rFonts w:ascii="TH Sarabun New" w:hAnsi="TH Sarabun New" w:cs="TH Sarabun New"/>
-          <w:sz w:val="36"/>
-          <w:szCs w:val="36"/>
-          <w:cs/>
-        </w:rPr>
-        <w:t>ปวท</w:t>
-      </w:r>
-      <w:proofErr w:type="spellEnd"/>
-      <w:r>
-        <w:rPr>
-          <w:rFonts w:ascii="TH Sarabun New" w:hAnsi="TH Sarabun New" w:cs="TH Sarabun New"/>
-          <w:sz w:val="36"/>
-          <w:szCs w:val="36"/>
-          <w:cs/>
-        </w:rPr>
-        <w:t>.) ระดับประกาศนียบัตรวิชาชีพชั้นสูง (ปวส.) ระดับอนุปริญญา ระดับปริญญาตรี หรือเทียบเท่าไม่กำหนดจำนวนชั่วโมง</w:t>
-      </w:r>
-    </w:p>
-    <w:p>
-      <w:pPr>
-        <w:rPr>
-          <w:rFonts w:ascii="TH Sarabun New" w:hAnsi="TH Sarabun New" w:cs="TH Sarabun New" w:hint="cs"/>
-          <w:sz w:val="36"/>
-          <w:szCs w:val="36"/>
-        </w:rPr>
-      </w:pPr>
-      <w:r>
-        <w:rPr>
-          <w:rFonts w:ascii="TH Sarabun New" w:hAnsi="TH Sarabun New" w:cs="TH Sarabun New"/>
-          <w:sz w:val="36"/>
-          <w:szCs w:val="36"/>
-          <w:cs/>
-        </w:rPr>
-        <w:t>(ค) กรณีเป็นผู้กู้ยืมเงินรายเก่าเลื่อนชั้นปีทุกระดับการศึกษา กำหนดจำนวนไม่น้อยกว่าสามสิบหกชั่วโมง</w:t>
-      </w:r>
-    </w:p>
-    <w:p>
-      <w:pPr>
-        <w:rPr>
-          <w:rFonts w:ascii="TH Sarabun New" w:hAnsi="TH Sarabun New" w:cs="TH Sarabun New"/>
-          <w:sz w:val="36"/>
-          <w:szCs w:val="36"/>
-        </w:rPr>
-      </w:pPr>
-      <w:r>
-        <w:rPr>
-          <w:rFonts w:ascii="TH Sarabun New" w:hAnsi="TH Sarabun New" w:cs="TH Sarabun New"/>
-          <w:sz w:val="36"/>
-          <w:szCs w:val="36"/>
-          <w:cs/>
-        </w:rPr>
-        <w:t>การทำประโยชน์ต่อสังคมหรือสาธารณะตามวรรคหนึ่ง หมายถึง การบำเพ็ญตนให้เป็นประโยชน์ ต่อชุมชน สังคมหรือประเทศชาติในลักษณะอาสาสมัคร เพื่อช่วยขัดเกลาจิตใจให้มีความเมตตากรุณามีความเสียสละ และมีจิตสาธารณะ เพื่อช่วยสร้างสรรค์สังคมหรือสาธารณะให้อยู่ร่วมกันอย่างมีความสุข ซึ่งจะต้องไม่เป็นส่วนหนึ่ง ของการเรียนการสอนและไม่ได้รับค่าตอบแทนในลักษณะการจ้าง</w:t>
-      </w:r>
-    </w:p>
-    <w:p>
-      <w:pPr>
-        <w:rPr>
-          <w:rFonts w:ascii="TH Sarabun New" w:hAnsi="TH Sarabun New" w:cs="TH Sarabun New"/>
-          <w:sz w:val="36"/>
-          <w:szCs w:val="36"/>
-        </w:rPr>
-      </w:pPr>
-    </w:p>
-    <w:p>
-      <w:pPr>
-        <w:ind w:firstLine="720"/>
-        <w:rPr>
-          <w:rFonts w:ascii="TH Sarabun New" w:hAnsi="TH Sarabun New" w:cs="TH Sarabun New" w:hint="cs"/>
-          <w:sz w:val="36"/>
-          <w:szCs w:val="36"/>
-        </w:rPr>
-      </w:pPr>
-      <w:r>
-        <w:rPr>
-          <w:rFonts w:ascii="TH Sarabun New" w:hAnsi="TH Sarabun New" w:cs="TH Sarabun New"/>
-          <w:sz w:val="36"/>
-          <w:szCs w:val="36"/>
-          <w:cs/>
-        </w:rPr>
-        <w:t>5. นักเรียนหรือนักศึกษา หากประสงค์จะกู้ยืมเงินค่าครองชีพจะต้องเป็นผู้ที่มีรายได้ต่อครอบครัว ไม่เกินสามแสนหกหมื่นบาทต่อปี ทั้งนี้ รายได้ต่อครอบครัวให้พิจารณาจากหลักเกณฑ์ข้อใดข้อหนึ่ง ดังนี้</w:t>
-      </w:r>
-    </w:p>
-    <w:p>
-      <w:pPr>
-        <w:rPr>
-          <w:rFonts w:ascii="TH Sarabun New" w:hAnsi="TH Sarabun New" w:cs="TH Sarabun New" w:hint="cs"/>
-          <w:sz w:val="36"/>
-          <w:szCs w:val="36"/>
-        </w:rPr>
-      </w:pPr>
-      <w:r>
-        <w:rPr>
-          <w:rFonts w:ascii="TH Sarabun New" w:hAnsi="TH Sarabun New" w:cs="TH Sarabun New"/>
-          <w:sz w:val="36"/>
-          <w:szCs w:val="36"/>
-          <w:cs/>
-        </w:rPr>
-        <w:t>(ก) รายได้รวมของนักเรียนหรือนักศึกษาผู้ขอกู้ยืมเงิน รวมกับรายได้ของบิดามารดา ในกรณีที่ บิดา มารดาเป็นผู้ใช้อำนาจปกครอง</w:t>
-      </w:r>
-    </w:p>
-    <w:p>
-      <w:pPr>
-        <w:rPr>
-          <w:rFonts w:ascii="TH Sarabun New" w:hAnsi="TH Sarabun New" w:cs="TH Sarabun New" w:hint="cs"/>
-          <w:sz w:val="36"/>
-          <w:szCs w:val="36"/>
-        </w:rPr>
-      </w:pPr>
-      <w:r>
-        <w:rPr>
-          <w:rFonts w:ascii="TH Sarabun New" w:hAnsi="TH Sarabun New" w:cs="TH Sarabun New"/>
-          <w:sz w:val="36"/>
-          <w:szCs w:val="36"/>
-          <w:cs/>
-        </w:rPr>
-        <w:t>(ข) รายได้รวมของนักเรียนหรือนักศึกษาผู้ขอกู้ยืมเงิน รวมกับรายได้ของผู้ปกครอง ในกรณีที่ ผู้ใช้อำนาจปกครองมิใช่บิดา มารดา</w:t>
-      </w:r>
-    </w:p>
-    <w:p>
-      <w:pPr>
-        <w:rPr>
-          <w:rFonts w:ascii="TH Sarabun New" w:hAnsi="TH Sarabun New" w:cs="TH Sarabun New" w:hint="cs"/>
-          <w:sz w:val="36"/>
-          <w:szCs w:val="36"/>
-        </w:rPr>
-      </w:pPr>
-      <w:r>
-        <w:rPr>
-          <w:rFonts w:ascii="TH Sarabun New" w:hAnsi="TH Sarabun New" w:cs="TH Sarabun New"/>
-          <w:sz w:val="36"/>
-          <w:szCs w:val="36"/>
-          <w:cs/>
-        </w:rPr>
-        <w:t>(ค) รายได้รวมของนักเรียนหรือนักศึกษาผู้ขอกู้ยืมเงิน รวมกับรายได้ของคู่สมรส ในกรณีผู้ขอกู้ยืมเงินได้ทำการสมรสแล้ว</w:t>
-      </w:r>
-    </w:p>
-    <w:p>
-      <w:pPr>
-        <w:rPr>
-          <w:rFonts w:ascii="TH Sarabun New" w:hAnsi="TH Sarabun New" w:cs="TH Sarabun New"/>
-          <w:sz w:val="36"/>
-          <w:szCs w:val="36"/>
-        </w:rPr>
-      </w:pPr>
-      <w:r>
-        <w:rPr>
-          <w:rFonts w:ascii="TH Sarabun New" w:hAnsi="TH Sarabun New" w:cs="TH Sarabun New"/>
-          <w:sz w:val="36"/>
-          <w:szCs w:val="36"/>
-          <w:cs/>
-        </w:rPr>
-        <w:t>หลักเกณฑ์และวิธีการตรวจสอบว่านักเรียนหรือนักศึกษาเป็นผู้ที่มีรายได้ต่อครอบครัวไม่เกิน  สามแสนหกหมื่นบาทต่อปีหรือไม่ ให้เป็นไปตามที่กองทุนกำหนด</w:t>
-      </w:r>
-    </w:p>
-    <w:p>
-      <w:pPr>
-        <w:rPr>
-          <w:rFonts w:ascii="TH Sarabun New" w:hAnsi="TH Sarabun New" w:cs="TH Sarabun New" w:hint="cs"/>
-          <w:sz w:val="36"/>
-          <w:szCs w:val="36"/>
-        </w:rPr>
-      </w:pPr>
-      <w:r>
-        <w:rPr>
-          <w:rFonts w:ascii="TH Sarabun New" w:hAnsi="TH Sarabun New" w:cs="TH Sarabun New"/>
-          <w:sz w:val="36"/>
-          <w:szCs w:val="36"/>
-          <w:cs/>
-        </w:rPr>
-        <w:tab/>
-      </w:r>
-      <w:r>
-        <w:rPr>
-          <w:rFonts w:ascii="TH Sarabun New" w:hAnsi="TH Sarabun New" w:cs="TH Sarabun New" w:hint="cs"/>
-          <w:sz w:val="36"/>
-          <w:szCs w:val="36"/>
-          <w:cs/>
-        </w:rPr>
-        <w:t>ลั</w:t>
-      </w:r>
-      <w:r>
-        <w:rPr>
-          <w:rFonts w:ascii="TH Sarabun New" w:hAnsi="TH Sarabun New" w:cs="TH Sarabun New"/>
-          <w:sz w:val="36"/>
-          <w:szCs w:val="36"/>
-          <w:cs/>
-        </w:rPr>
-        <w:t>กษณะที่ 3 ให้การสนับสนุนและส่งเสริมการศึกษาแก่นักเรียนหรือนักศึกษาที่ศึกษาในสาขาวิชาขาดแคลนหรือสาขาวิชาที่กองทุนมุ่งส่งเสริมเป็นพิเศษ กองทุนจะให้กู้ยืมเงินเพื่อเป็นค่าเล่าเรียนและค่าใช้จ่าย ที่เกี่ยวเนื่องกับการศึกษา สำหรับการขอกู้ยืมเงินเพื่อเป็นค่าครองชีพ กองทุนจะพิจารณาจากรายได้ต่อครอบครัว ของผู้กู้ยืมเงินตามที่กำหนดในข้อ (5)</w:t>
-      </w:r>
-    </w:p>
-    <w:p>
-      <w:pPr>
-        <w:ind w:firstLine="720"/>
-        <w:rPr>
-          <w:rFonts w:ascii="TH Sarabun New" w:hAnsi="TH Sarabun New" w:cs="TH Sarabun New" w:hint="cs"/>
-          <w:sz w:val="36"/>
-          <w:szCs w:val="36"/>
-        </w:rPr>
-      </w:pPr>
-      <w:r>
-        <w:rPr>
-          <w:rFonts w:ascii="TH Sarabun New" w:hAnsi="TH Sarabun New" w:cs="TH Sarabun New"/>
-          <w:sz w:val="36"/>
-          <w:szCs w:val="36"/>
-          <w:cs/>
-        </w:rPr>
-        <w:t>1. เป็นผู้ที่ศึกษาในสาขาวิชาขาดแคลนหรือสาขาวิชาที่กองทุนมุ่งส่งเสริมเป็นพิเศษ ตามประกาศคณะกรรมการกองทุนเงินให้กู้ยืมเพื่อการศึกษา</w:t>
-      </w:r>
-    </w:p>
-    <w:p>
-      <w:pPr>
-        <w:ind w:firstLine="720"/>
-        <w:rPr>
-          <w:rFonts w:ascii="TH Sarabun New" w:hAnsi="TH Sarabun New" w:cs="TH Sarabun New" w:hint="cs"/>
-          <w:sz w:val="36"/>
-          <w:szCs w:val="36"/>
-        </w:rPr>
-      </w:pPr>
-      <w:r>
-        <w:rPr>
-          <w:rFonts w:ascii="TH Sarabun New" w:hAnsi="TH Sarabun New" w:cs="TH Sarabun New"/>
-          <w:sz w:val="36"/>
-          <w:szCs w:val="36"/>
-          <w:cs/>
-        </w:rPr>
-        <w:t>2. เป็นผู้ที่มีอายุไม่เกิน 30 ปีบริบูรณ์ ในปีการศึกษาที่ยื่นคำขอกู้ยืมเงินกองทุนครั้งแรก</w:t>
-      </w:r>
-    </w:p>
-    <w:p>
-      <w:pPr>
-        <w:ind w:firstLine="720"/>
-        <w:rPr>
-          <w:rFonts w:ascii="TH Sarabun New" w:hAnsi="TH Sarabun New" w:cs="TH Sarabun New"/>
-          <w:sz w:val="36"/>
-          <w:szCs w:val="36"/>
-        </w:rPr>
-      </w:pPr>
-      <w:r>
-        <w:rPr>
-          <w:rFonts w:ascii="TH Sarabun New" w:hAnsi="TH Sarabun New" w:cs="TH Sarabun New"/>
-          <w:sz w:val="36"/>
-          <w:szCs w:val="36"/>
-          <w:cs/>
-        </w:rPr>
-        <w:t>3. เป็นผู้ที่เข้าศึกษาในระดับการศึกษาและหลักสูตร/ประเภทวิชาและสาขาวิชา ดังนี้</w:t>
-      </w:r>
-    </w:p>
-    <w:p>
-      <w:pPr>
-        <w:rPr>
-          <w:rFonts w:ascii="TH Sarabun New" w:hAnsi="TH Sarabun New" w:cs="TH Sarabun New"/>
-          <w:sz w:val="36"/>
-          <w:szCs w:val="36"/>
-        </w:rPr>
-      </w:pPr>
-    </w:p>
-    <w:p>
-      <w:pPr>
-        <w:rPr>
-          <w:rFonts w:ascii="TH Sarabun New" w:hAnsi="TH Sarabun New" w:cs="TH Sarabun New" w:hint="cs"/>
+          <w:rFonts w:ascii="TH Sarabun New" w:hAnsi="TH Sarabun New" w:cs="TH Sarabun New"/>
+          <w:sz w:val="36"/>
+          <w:szCs w:val="36"/>
+        </w:rPr>
+      </w:pPr>
+    </w:p>
+    <w:p>
+      <w:pPr>
+        <w:rPr>
+          <w:rFonts w:ascii="TH Sarabun New" w:hAnsi="TH Sarabun New" w:cs="TH Sarabun New"/>
           <w:sz w:val="36"/>
           <w:szCs w:val="36"/>
         </w:rPr>
@@ -1366,7 +1399,7 @@
     <w:p>
       <w:pPr>
         <w:rPr>
-          <w:rFonts w:ascii="TH Sarabun New" w:hAnsi="TH Sarabun New" w:cs="TH Sarabun New" w:hint="cs"/>
+          <w:rFonts w:ascii="TH Sarabun New" w:hAnsi="TH Sarabun New" w:cs="TH Sarabun New"/>
           <w:sz w:val="36"/>
           <w:szCs w:val="36"/>
         </w:rPr>
@@ -1385,7 +1418,7 @@
       <w:pPr>
         <w:ind w:firstLine="720"/>
         <w:rPr>
-          <w:rFonts w:ascii="TH Sarabun New" w:hAnsi="TH Sarabun New" w:cs="TH Sarabun New" w:hint="cs"/>
+          <w:rFonts w:ascii="TH Sarabun New" w:hAnsi="TH Sarabun New" w:cs="TH Sarabun New"/>
           <w:sz w:val="36"/>
           <w:szCs w:val="36"/>
         </w:rPr>
@@ -1403,7 +1436,7 @@
     <w:p>
       <w:pPr>
         <w:rPr>
-          <w:rFonts w:ascii="TH Sarabun New" w:hAnsi="TH Sarabun New" w:cs="TH Sarabun New" w:hint="cs"/>
+          <w:rFonts w:ascii="TH Sarabun New" w:hAnsi="TH Sarabun New" w:cs="TH Sarabun New"/>
           <w:sz w:val="36"/>
           <w:szCs w:val="36"/>
         </w:rPr>
@@ -1421,7 +1454,7 @@
     <w:p>
       <w:pPr>
         <w:rPr>
-          <w:rFonts w:ascii="TH Sarabun New" w:hAnsi="TH Sarabun New" w:cs="TH Sarabun New" w:hint="cs"/>
+          <w:rFonts w:ascii="TH Sarabun New" w:hAnsi="TH Sarabun New" w:cs="TH Sarabun New"/>
           <w:sz w:val="36"/>
           <w:szCs w:val="36"/>
         </w:rPr>
@@ -1459,7 +1492,7 @@
     <w:p>
       <w:pPr>
         <w:rPr>
-          <w:rFonts w:ascii="TH Sarabun New" w:hAnsi="TH Sarabun New" w:cs="TH Sarabun New" w:hint="cs"/>
+          <w:rFonts w:ascii="TH Sarabun New" w:hAnsi="TH Sarabun New" w:cs="TH Sarabun New"/>
           <w:sz w:val="36"/>
           <w:szCs w:val="36"/>
         </w:rPr>
@@ -1477,7 +1510,7 @@
     <w:p>
       <w:pPr>
         <w:rPr>
-          <w:rFonts w:ascii="TH Sarabun New" w:hAnsi="TH Sarabun New" w:cs="TH Sarabun New" w:hint="cs"/>
+          <w:rFonts w:ascii="TH Sarabun New" w:hAnsi="TH Sarabun New" w:cs="TH Sarabun New"/>
           <w:sz w:val="36"/>
           <w:szCs w:val="36"/>
         </w:rPr>
@@ -1496,19 +1529,36 @@
       <w:pPr>
         <w:ind w:firstLine="720"/>
         <w:rPr>
-          <w:rFonts w:ascii="TH Sarabun New" w:hAnsi="TH Sarabun New" w:cs="TH Sarabun New" w:hint="cs"/>
-          <w:sz w:val="36"/>
-          <w:szCs w:val="36"/>
-        </w:rPr>
-      </w:pPr>
-      <w:r>
-        <w:rPr>
-          <w:rFonts w:ascii="TH Sarabun New" w:hAnsi="TH Sarabun New" w:cs="TH Sarabun New"/>
-          <w:sz w:val="36"/>
-          <w:szCs w:val="36"/>
-          <w:cs/>
-        </w:rPr>
-        <w:t>5. นักเรียนหรือนักศึกษา หากประสงค์จะกู้ยืมเงินค่าครองชีพจะต้องเป็นผู้ที่มีรายได้ต่อครอบครัวไม่เกินสามแสนหกหมื่นบาทต่อปี ทั้งนี้ รายได้ต่อครอบครัวให้พิจารณาจากหลักเกณฑ์ข้อใดข้อหนึ่ง ดังนี้</w:t>
+          <w:rFonts w:ascii="TH Sarabun New" w:hAnsi="TH Sarabun New" w:cs="TH Sarabun New"/>
+          <w:sz w:val="36"/>
+          <w:szCs w:val="36"/>
+        </w:rPr>
+      </w:pPr>
+      <w:r>
+        <w:rPr>
+          <w:rFonts w:ascii="TH Sarabun New" w:hAnsi="TH Sarabun New" w:cs="TH Sarabun New"/>
+          <w:sz w:val="36"/>
+          <w:szCs w:val="36"/>
+          <w:cs/>
+        </w:rPr>
+        <w:t>5. นักเรียนหรือนักศึกษา หากประสงค์จะกู้ยืมเงินค่าครองชีพจะต้องเป็นผู้ที่มีรายได้ต่อครอบครัวไม่เกิน</w:t>
+      </w:r>
+      <w:r>
+        <w:rPr>
+          <w:rFonts w:ascii="TH Sarabun New" w:hAnsi="TH Sarabun New" w:cs="TH Sarabun New"/>
+          <w:sz w:val="36"/>
+          <w:szCs w:val="36"/>
+        </w:rPr>
+        <w:t>360,000</w:t>
+      </w:r>
+      <w:r>
+        <w:rPr>
+          <w:rFonts w:ascii="TH Sarabun New" w:hAnsi="TH Sarabun New" w:cs="TH Sarabun New"/>
+          <w:sz w:val="36"/>
+          <w:szCs w:val="36"/>
+          <w:cs/>
+        </w:rPr>
+        <w:t>บาทต่อปี ทั้งนี้ รายได้ต่อครอบครัวให้พิจารณาจากหลักเกณฑ์ข้อใดข้อหนึ่ง ดังนี้</w:t>
       </w:r>
     </w:p>
     <w:p>
@@ -1541,7 +1591,7 @@
     <w:p>
       <w:pPr>
         <w:rPr>
-          <w:rFonts w:ascii="TH Sarabun New" w:hAnsi="TH Sarabun New" w:cs="TH Sarabun New" w:hint="cs"/>
+          <w:rFonts w:ascii="TH Sarabun New" w:hAnsi="TH Sarabun New" w:cs="TH Sarabun New"/>
           <w:sz w:val="36"/>
           <w:szCs w:val="36"/>
         </w:rPr>
@@ -1560,7 +1610,7 @@
     <w:p>
       <w:pPr>
         <w:rPr>
-          <w:rFonts w:ascii="TH Sarabun New" w:hAnsi="TH Sarabun New" w:cs="TH Sarabun New" w:hint="cs"/>
+          <w:rFonts w:ascii="TH Sarabun New" w:hAnsi="TH Sarabun New" w:cs="TH Sarabun New"/>
           <w:sz w:val="36"/>
           <w:szCs w:val="36"/>
         </w:rPr>
@@ -1590,14 +1640,31 @@
           <w:szCs w:val="36"/>
           <w:cs/>
         </w:rPr>
-        <w:t>หลักเกณฑ์และวิธีการตรวจสอบว่านักเรียนหรือนักศึกษาเป็นผู้ที่มีรายได้ต่อครอบครัวไม่เกิน  สามแสนหกหมื่นบาทต่อปีหรือไม่ ให้เป็นไปตามที่กองทุนกำหนด</w:t>
-      </w:r>
-    </w:p>
-    <w:p>
-      <w:pPr>
-        <w:ind w:firstLine="720"/>
-        <w:rPr>
-          <w:rFonts w:ascii="TH Sarabun New" w:hAnsi="TH Sarabun New" w:cs="TH Sarabun New" w:hint="cs"/>
+        <w:t xml:space="preserve">หลักเกณฑ์และวิธีการตรวจสอบว่านักเรียนหรือนักศึกษาเป็นผู้ที่มีรายได้ต่อครอบครัวไม่เกิน  </w:t>
+      </w:r>
+      <w:r>
+        <w:rPr>
+          <w:rFonts w:ascii="TH Sarabun New" w:hAnsi="TH Sarabun New" w:cs="TH Sarabun New"/>
+          <w:sz w:val="36"/>
+          <w:szCs w:val="36"/>
+        </w:rPr>
+        <w:t>360,000</w:t>
+      </w:r>
+      <w:r>
+        <w:rPr>
+          <w:rFonts w:ascii="TH Sarabun New" w:hAnsi="TH Sarabun New" w:cs="TH Sarabun New"/>
+          <w:sz w:val="36"/>
+          <w:szCs w:val="36"/>
+          <w:cs/>
+        </w:rPr>
+        <w:t>บาทต่อปีหรือไม่ ให้เป็นไปตามที่กองทุนกำหนด</w:t>
+      </w:r>
+    </w:p>
+    <w:p>
+      <w:pPr>
+        <w:ind w:firstLine="720"/>
+        <w:rPr>
+          <w:rFonts w:ascii="TH Sarabun New" w:hAnsi="TH Sarabun New" w:cs="TH Sarabun New"/>
           <w:sz w:val="36"/>
           <w:szCs w:val="36"/>
         </w:rPr>
@@ -1616,7 +1683,7 @@
       <w:pPr>
         <w:ind w:firstLine="720"/>
         <w:rPr>
-          <w:rFonts w:ascii="TH Sarabun New" w:hAnsi="TH Sarabun New" w:cs="TH Sarabun New" w:hint="cs"/>
+          <w:rFonts w:ascii="TH Sarabun New" w:hAnsi="TH Sarabun New" w:cs="TH Sarabun New"/>
           <w:sz w:val="36"/>
           <w:szCs w:val="36"/>
         </w:rPr>
@@ -1635,7 +1702,7 @@
       <w:pPr>
         <w:ind w:firstLine="720"/>
         <w:rPr>
-          <w:rFonts w:ascii="TH Sarabun New" w:hAnsi="TH Sarabun New" w:cs="TH Sarabun New" w:hint="cs"/>
+          <w:rFonts w:ascii="TH Sarabun New" w:hAnsi="TH Sarabun New" w:cs="TH Sarabun New"/>
           <w:sz w:val="36"/>
           <w:szCs w:val="36"/>
         </w:rPr>
@@ -1654,7 +1721,7 @@
       <w:pPr>
         <w:ind w:firstLine="720"/>
         <w:rPr>
-          <w:rFonts w:ascii="TH Sarabun New" w:hAnsi="TH Sarabun New" w:cs="TH Sarabun New" w:hint="cs"/>
+          <w:rFonts w:ascii="TH Sarabun New" w:hAnsi="TH Sarabun New" w:cs="TH Sarabun New"/>
           <w:sz w:val="36"/>
           <w:szCs w:val="36"/>
         </w:rPr>
@@ -1673,7 +1740,7 @@
       <w:pPr>
         <w:ind w:firstLine="720"/>
         <w:rPr>
-          <w:rFonts w:ascii="TH Sarabun New" w:hAnsi="TH Sarabun New" w:cs="TH Sarabun New" w:hint="cs"/>
+          <w:rFonts w:ascii="TH Sarabun New" w:hAnsi="TH Sarabun New" w:cs="TH Sarabun New"/>
           <w:sz w:val="36"/>
           <w:szCs w:val="36"/>
         </w:rPr>
@@ -1691,7 +1758,7 @@
     <w:p>
       <w:pPr>
         <w:rPr>
-          <w:rFonts w:ascii="TH Sarabun New" w:hAnsi="TH Sarabun New" w:cs="TH Sarabun New" w:hint="cs"/>
+          <w:rFonts w:ascii="TH Sarabun New" w:hAnsi="TH Sarabun New" w:cs="TH Sarabun New"/>
           <w:sz w:val="36"/>
           <w:szCs w:val="36"/>
         </w:rPr>
@@ -1709,7 +1776,7 @@
     <w:p>
       <w:pPr>
         <w:rPr>
-          <w:rFonts w:ascii="TH Sarabun New" w:hAnsi="TH Sarabun New" w:cs="TH Sarabun New" w:hint="cs"/>
+          <w:rFonts w:ascii="TH Sarabun New" w:hAnsi="TH Sarabun New" w:cs="TH Sarabun New"/>
           <w:sz w:val="36"/>
           <w:szCs w:val="36"/>
         </w:rPr>
@@ -1728,7 +1795,7 @@
       <w:pPr>
         <w:ind w:firstLine="720"/>
         <w:rPr>
-          <w:rFonts w:ascii="TH Sarabun New" w:hAnsi="TH Sarabun New" w:cs="TH Sarabun New" w:hint="cs"/>
+          <w:rFonts w:ascii="TH Sarabun New" w:hAnsi="TH Sarabun New" w:cs="TH Sarabun New"/>
           <w:sz w:val="36"/>
           <w:szCs w:val="36"/>
         </w:rPr>
@@ -1746,7 +1813,7 @@
     <w:p>
       <w:pPr>
         <w:rPr>
-          <w:rFonts w:ascii="TH Sarabun New" w:hAnsi="TH Sarabun New" w:cs="TH Sarabun New" w:hint="cs"/>
+          <w:rFonts w:ascii="TH Sarabun New" w:hAnsi="TH Sarabun New" w:cs="TH Sarabun New"/>
           <w:sz w:val="36"/>
           <w:szCs w:val="36"/>
         </w:rPr>
@@ -1765,7 +1832,7 @@
     <w:p>
       <w:pPr>
         <w:rPr>
-          <w:rFonts w:ascii="TH Sarabun New" w:hAnsi="TH Sarabun New" w:cs="TH Sarabun New" w:hint="cs"/>
+          <w:rFonts w:ascii="TH Sarabun New" w:hAnsi="TH Sarabun New" w:cs="TH Sarabun New"/>
           <w:sz w:val="36"/>
           <w:szCs w:val="36"/>
         </w:rPr>
@@ -1803,7 +1870,7 @@
     <w:p>
       <w:pPr>
         <w:rPr>
-          <w:rFonts w:ascii="TH Sarabun New" w:hAnsi="TH Sarabun New" w:cs="TH Sarabun New" w:hint="cs"/>
+          <w:rFonts w:ascii="TH Sarabun New" w:hAnsi="TH Sarabun New" w:cs="TH Sarabun New"/>
           <w:sz w:val="36"/>
           <w:szCs w:val="36"/>
         </w:rPr>
@@ -1821,7 +1888,7 @@
     <w:p>
       <w:pPr>
         <w:rPr>
-          <w:rFonts w:ascii="TH Sarabun New" w:hAnsi="TH Sarabun New" w:cs="TH Sarabun New" w:hint="cs"/>
+          <w:rFonts w:ascii="TH Sarabun New" w:hAnsi="TH Sarabun New" w:cs="TH Sarabun New"/>
           <w:sz w:val="36"/>
           <w:szCs w:val="36"/>
         </w:rPr>
@@ -1840,7 +1907,7 @@
       <w:pPr>
         <w:ind w:firstLine="720"/>
         <w:rPr>
-          <w:rFonts w:ascii="TH Sarabun New" w:hAnsi="TH Sarabun New" w:cs="TH Sarabun New" w:hint="cs"/>
+          <w:rFonts w:ascii="TH Sarabun New" w:hAnsi="TH Sarabun New" w:cs="TH Sarabun New"/>
           <w:sz w:val="36"/>
           <w:szCs w:val="36"/>
         </w:rPr>
@@ -1858,7 +1925,7 @@
     <w:p>
       <w:pPr>
         <w:rPr>
-          <w:rFonts w:ascii="TH Sarabun New" w:hAnsi="TH Sarabun New" w:cs="TH Sarabun New" w:hint="cs"/>
+          <w:rFonts w:ascii="TH Sarabun New" w:hAnsi="TH Sarabun New" w:cs="TH Sarabun New"/>
           <w:sz w:val="36"/>
           <w:szCs w:val="36"/>
         </w:rPr>
@@ -1876,7 +1943,7 @@
     <w:p>
       <w:pPr>
         <w:rPr>
-          <w:rFonts w:ascii="TH Sarabun New" w:hAnsi="TH Sarabun New" w:cs="TH Sarabun New" w:hint="cs"/>
+          <w:rFonts w:ascii="TH Sarabun New" w:hAnsi="TH Sarabun New" w:cs="TH Sarabun New"/>
           <w:sz w:val="36"/>
           <w:szCs w:val="36"/>
         </w:rPr>
@@ -1894,7 +1961,7 @@
     <w:p>
       <w:pPr>
         <w:rPr>
-          <w:rFonts w:ascii="TH Sarabun New" w:hAnsi="TH Sarabun New" w:cs="TH Sarabun New" w:hint="cs"/>
+          <w:rFonts w:ascii="TH Sarabun New" w:hAnsi="TH Sarabun New" w:cs="TH Sarabun New"/>
           <w:sz w:val="36"/>
           <w:szCs w:val="36"/>
         </w:rPr>
@@ -1924,22 +1991,47 @@
           <w:szCs w:val="36"/>
           <w:cs/>
         </w:rPr>
-        <w:t>หลักเกณฑ์และวิธีการตรวจสอบว่านักเรียนหรือนักศึกษาเป็นผู้ที่มีรายได้ต่อครอบครัวไม่เกิน สามแสนหกหมื่นบาทต่อปีหรือไม่ ให้เป็นไปตามที่กองทุนกำหนด</w:t>
-      </w:r>
-    </w:p>
-    <w:p>
-      <w:pPr>
-        <w:rPr>
-          <w:rFonts w:ascii="TH Sarabun New" w:hAnsi="TH Sarabun New" w:cs="TH Sarabun New"/>
-          <w:sz w:val="36"/>
-          <w:szCs w:val="36"/>
-        </w:rPr>
-      </w:pPr>
-    </w:p>
-    <w:p>
-      <w:pPr>
-        <w:rPr>
-          <w:rFonts w:ascii="TH Sarabun New" w:hAnsi="TH Sarabun New" w:cs="TH Sarabun New" w:hint="cs"/>
+        <w:t xml:space="preserve">หลักเกณฑ์และวิธีการตรวจสอบว่านักเรียนหรือนักศึกษาเป็นผู้ที่มีรายได้ต่อครอบครัวไม่เกิน </w:t>
+      </w:r>
+      <w:r>
+        <w:rPr>
+          <w:rFonts w:ascii="TH Sarabun New" w:hAnsi="TH Sarabun New" w:cs="TH Sarabun New"/>
+          <w:sz w:val="36"/>
+          <w:szCs w:val="36"/>
+        </w:rPr>
+        <w:t>360,000</w:t>
+      </w:r>
+      <w:r>
+        <w:rPr>
+          <w:rFonts w:ascii="TH Sarabun New" w:hAnsi="TH Sarabun New" w:cs="TH Sarabun New"/>
+          <w:sz w:val="36"/>
+          <w:szCs w:val="36"/>
+        </w:rPr>
+        <w:t xml:space="preserve"> </w:t>
+      </w:r>
+      <w:r>
+        <w:rPr>
+          <w:rFonts w:ascii="TH Sarabun New" w:hAnsi="TH Sarabun New" w:cs="TH Sarabun New"/>
+          <w:sz w:val="36"/>
+          <w:szCs w:val="36"/>
+          <w:cs/>
+        </w:rPr>
+        <w:t>บาทต่อปีหรือไม่ ให้เป็นไปตามที่กองทุนกำหนด</w:t>
+      </w:r>
+    </w:p>
+    <w:p>
+      <w:pPr>
+        <w:rPr>
+          <w:rFonts w:ascii="TH Sarabun New" w:hAnsi="TH Sarabun New" w:cs="TH Sarabun New"/>
+          <w:sz w:val="36"/>
+          <w:szCs w:val="36"/>
+        </w:rPr>
+      </w:pPr>
+    </w:p>
+    <w:p>
+      <w:pPr>
+        <w:rPr>
+          <w:rFonts w:ascii="TH Sarabun New" w:hAnsi="TH Sarabun New" w:cs="TH Sarabun New"/>
           <w:sz w:val="36"/>
           <w:szCs w:val="36"/>
         </w:rPr>
@@ -1958,7 +2050,7 @@
     <w:p>
       <w:pPr>
         <w:rPr>
-          <w:rFonts w:ascii="TH Sarabun New" w:hAnsi="TH Sarabun New" w:cs="TH Sarabun New" w:hint="cs"/>
+          <w:rFonts w:ascii="TH Sarabun New" w:hAnsi="TH Sarabun New" w:cs="TH Sarabun New"/>
           <w:sz w:val="36"/>
           <w:szCs w:val="36"/>
         </w:rPr>
@@ -1996,7 +2088,7 @@
     <w:p>
       <w:pPr>
         <w:rPr>
-          <w:rFonts w:ascii="TH Sarabun New" w:hAnsi="TH Sarabun New" w:cs="TH Sarabun New" w:hint="cs"/>
+          <w:rFonts w:ascii="TH Sarabun New" w:hAnsi="TH Sarabun New" w:cs="TH Sarabun New"/>
           <w:sz w:val="36"/>
           <w:szCs w:val="36"/>
         </w:rPr>
@@ -2023,7 +2115,7 @@
     <w:p>
       <w:pPr>
         <w:rPr>
-          <w:rFonts w:ascii="TH Sarabun New" w:hAnsi="TH Sarabun New" w:cs="TH Sarabun New" w:hint="cs"/>
+          <w:rFonts w:ascii="TH Sarabun New" w:hAnsi="TH Sarabun New" w:cs="TH Sarabun New"/>
           <w:sz w:val="36"/>
           <w:szCs w:val="36"/>
         </w:rPr>
@@ -2059,7 +2151,7 @@
     <w:p>
       <w:pPr>
         <w:rPr>
-          <w:rFonts w:ascii="TH Sarabun New" w:hAnsi="TH Sarabun New" w:cs="TH Sarabun New" w:hint="cs"/>
+          <w:rFonts w:ascii="TH Sarabun New" w:hAnsi="TH Sarabun New" w:cs="TH Sarabun New"/>
           <w:sz w:val="36"/>
           <w:szCs w:val="36"/>
           <w:cs/>

</xml_diff>